<commit_message>
Add precis and format paper properly.
</commit_message>
<xml_diff>
--- a/Atestat.docx
+++ b/Atestat.docx
@@ -672,30 +672,186 @@
     </w:p>
     <w:p>
       <w:pPr>
-        <w:spacing w:line="360" w:lineRule="auto"/>
-        <w:jc w:val="both"/>
-        <w:rPr>
-          <w:rFonts w:ascii="Times New Roman" w:hAnsi="Times New Roman" w:cs="Times New Roman"/>
-        </w:rPr>
-      </w:pPr>
-    </w:p>
-    <w:p>
-      <w:pPr>
-        <w:spacing w:line="360" w:lineRule="auto"/>
-        <w:jc w:val="both"/>
-        <w:rPr>
-          <w:rFonts w:ascii="Times New Roman" w:hAnsi="Times New Roman" w:cs="Times New Roman"/>
-        </w:rPr>
-      </w:pPr>
-    </w:p>
-    <w:p>
-      <w:pPr>
-        <w:spacing w:line="360" w:lineRule="auto"/>
-        <w:jc w:val="both"/>
-        <w:rPr>
-          <w:rFonts w:ascii="Times New Roman" w:hAnsi="Times New Roman" w:cs="Times New Roman"/>
-        </w:rPr>
-      </w:pPr>
+        <w:rPr>
+          <w:rFonts w:ascii="Times New Roman" w:hAnsi="Times New Roman" w:cs="Times New Roman"/>
+        </w:rPr>
+      </w:pPr>
+      <w:r>
+        <w:rPr>
+          <w:rFonts w:ascii="Times New Roman" w:hAnsi="Times New Roman" w:cs="Times New Roman"/>
+        </w:rPr>
+        <w:br w:type="page"/>
+      </w:r>
+    </w:p>
+    <w:p>
+      <w:pPr>
+        <w:jc w:val="center"/>
+        <w:rPr>
+          <w:rFonts w:ascii="Times New Roman" w:hAnsi="Times New Roman" w:cs="Times New Roman"/>
+          <w:b/>
+          <w:bCs/>
+          <w:sz w:val="32"/>
+          <w:szCs w:val="32"/>
+        </w:rPr>
+      </w:pPr>
+      <w:r>
+        <w:rPr>
+          <w:rFonts w:ascii="Times New Roman" w:hAnsi="Times New Roman" w:cs="Times New Roman"/>
+          <w:b/>
+          <w:bCs/>
+          <w:sz w:val="32"/>
+          <w:szCs w:val="32"/>
+        </w:rPr>
+        <w:lastRenderedPageBreak/>
+        <w:t>Précis</w:t>
+      </w:r>
+    </w:p>
+    <w:p>
+      <w:pPr>
+        <w:spacing w:line="360" w:lineRule="auto"/>
+        <w:jc w:val="center"/>
+        <w:rPr>
+          <w:rFonts w:ascii="Times New Roman" w:hAnsi="Times New Roman" w:cs="Times New Roman"/>
+        </w:rPr>
+      </w:pPr>
+    </w:p>
+    <w:p>
+      <w:pPr>
+        <w:spacing w:line="360" w:lineRule="auto"/>
+        <w:jc w:val="center"/>
+        <w:rPr>
+          <w:rFonts w:ascii="Times New Roman" w:hAnsi="Times New Roman" w:cs="Times New Roman"/>
+        </w:rPr>
+      </w:pPr>
+    </w:p>
+    <w:p>
+      <w:pPr>
+        <w:spacing w:line="360" w:lineRule="auto"/>
+        <w:jc w:val="both"/>
+        <w:rPr>
+          <w:rFonts w:ascii="Times New Roman" w:hAnsi="Times New Roman" w:cs="Times New Roman"/>
+        </w:rPr>
+      </w:pPr>
+      <w:r>
+        <w:rPr>
+          <w:rFonts w:ascii="Times New Roman" w:hAnsi="Times New Roman" w:cs="Times New Roman"/>
+        </w:rPr>
+        <w:t>This paper ex</w:t>
+      </w:r>
+      <w:r>
+        <w:rPr>
+          <w:rFonts w:ascii="Times New Roman" w:hAnsi="Times New Roman" w:cs="Times New Roman"/>
+        </w:rPr>
+        <w:t>plores</w:t>
+      </w:r>
+      <w:r>
+        <w:rPr>
+          <w:rFonts w:ascii="Times New Roman" w:hAnsi="Times New Roman" w:cs="Times New Roman"/>
+        </w:rPr>
+        <w:t xml:space="preserve"> the impact of artificial intelligence on everyday life, focusing on how modern technologies influence work, personal routines, and </w:t>
+      </w:r>
+      <w:r>
+        <w:rPr>
+          <w:rFonts w:ascii="Times New Roman" w:hAnsi="Times New Roman" w:cs="Times New Roman"/>
+        </w:rPr>
+        <w:t>society</w:t>
+      </w:r>
+      <w:r>
+        <w:rPr>
+          <w:rFonts w:ascii="Times New Roman" w:hAnsi="Times New Roman" w:cs="Times New Roman"/>
+        </w:rPr>
+        <w:t>. Its purpose is to present both the benefits and the drawbacks of artificial intelligence, offering a balanced view of its growing role in contemporary life.</w:t>
+      </w:r>
+    </w:p>
+    <w:p>
+      <w:pPr>
+        <w:spacing w:line="360" w:lineRule="auto"/>
+        <w:jc w:val="both"/>
+        <w:rPr>
+          <w:rFonts w:ascii="Times New Roman" w:hAnsi="Times New Roman" w:cs="Times New Roman"/>
+        </w:rPr>
+      </w:pPr>
+      <w:r>
+        <w:rPr>
+          <w:rFonts w:ascii="Times New Roman" w:hAnsi="Times New Roman" w:cs="Times New Roman"/>
+          <w:b/>
+          <w:bCs/>
+        </w:rPr>
+        <w:t>Chapter 1 – Introduction</w:t>
+      </w:r>
+      <w:r>
+        <w:rPr>
+          <w:rFonts w:ascii="Times New Roman" w:hAnsi="Times New Roman" w:cs="Times New Roman"/>
+        </w:rPr>
+        <w:t xml:space="preserve"> outlines the development of artificial intelligence from its early theoretical origins to its widespread use today. It explains how technological progress and increased access to data have allowed AI to move from research environments into everyday applications.</w:t>
+      </w:r>
+    </w:p>
+    <w:p>
+      <w:pPr>
+        <w:spacing w:line="360" w:lineRule="auto"/>
+        <w:jc w:val="both"/>
+        <w:rPr>
+          <w:rFonts w:ascii="Times New Roman" w:hAnsi="Times New Roman" w:cs="Times New Roman"/>
+        </w:rPr>
+      </w:pPr>
+      <w:r>
+        <w:rPr>
+          <w:rFonts w:ascii="Times New Roman" w:hAnsi="Times New Roman" w:cs="Times New Roman"/>
+          <w:b/>
+          <w:bCs/>
+        </w:rPr>
+        <w:t>Chapter 2 – Benefits</w:t>
+      </w:r>
+      <w:r>
+        <w:rPr>
+          <w:rFonts w:ascii="Times New Roman" w:hAnsi="Times New Roman" w:cs="Times New Roman"/>
+        </w:rPr>
+        <w:t xml:space="preserve"> analyses the positive effects of artificial intelligence on daily life. The chapter discusses improvements in work environments through automation and increased flexibility, as well as enhancements in personal life through smart devices and digital services. It also examines the role of AI in the development of smart cities, focusing on more efficient transport systems, better energy management, and improved public services. Special attention is given to healthcare, where artificial intelligence supports early diagnosis, personalised treatment, and preventive care, contributing to a higher quality of life.</w:t>
+      </w:r>
+    </w:p>
+    <w:p>
+      <w:pPr>
+        <w:spacing w:line="360" w:lineRule="auto"/>
+        <w:jc w:val="both"/>
+        <w:rPr>
+          <w:rFonts w:ascii="Times New Roman" w:hAnsi="Times New Roman" w:cs="Times New Roman"/>
+        </w:rPr>
+      </w:pPr>
+      <w:r>
+        <w:rPr>
+          <w:rFonts w:ascii="Times New Roman" w:hAnsi="Times New Roman" w:cs="Times New Roman"/>
+          <w:b/>
+          <w:bCs/>
+        </w:rPr>
+        <w:t xml:space="preserve">Chapter 3 – </w:t>
+      </w:r>
+      <w:r>
+        <w:rPr>
+          <w:rFonts w:ascii="Times New Roman" w:hAnsi="Times New Roman" w:cs="Times New Roman"/>
+          <w:b/>
+          <w:bCs/>
+        </w:rPr>
+        <w:t>Drawbacks</w:t>
+      </w:r>
+      <w:r>
+        <w:rPr>
+          <w:rFonts w:ascii="Times New Roman" w:hAnsi="Times New Roman" w:cs="Times New Roman"/>
+        </w:rPr>
+        <w:t xml:space="preserve"> examines the negative consequences and risks associated with artificial intelligence in equal depth. It addresses concerns related to job displacement and economic inequality caused by automation, as well as the growing collection of personal data and the threat to individual privacy. The chapter also explores the ethical challenges of biased algorithms, unclear responsibility in AI decision-making, and increased dependence on technology. Furthermore, it considers the environmental impact of large-scale AI systems and the social effects of reduced human interaction in an increasingly digital world.</w:t>
+      </w:r>
+    </w:p>
+    <w:p>
+      <w:pPr>
+        <w:rPr>
+          <w:rFonts w:ascii="Times New Roman" w:hAnsi="Times New Roman" w:cs="Times New Roman"/>
+        </w:rPr>
+      </w:pPr>
+      <w:r>
+        <w:rPr>
+          <w:rFonts w:ascii="Times New Roman" w:hAnsi="Times New Roman" w:cs="Times New Roman"/>
+        </w:rPr>
+        <w:br w:type="page"/>
+      </w:r>
     </w:p>
     <w:p>
       <w:pPr>
@@ -939,7 +1095,7 @@
           <w:noProof/>
         </w:rPr>
         <w:drawing>
-          <wp:anchor distT="0" distB="0" distL="114300" distR="114300" simplePos="0" relativeHeight="251658240" behindDoc="1" locked="0" layoutInCell="1" allowOverlap="1" wp14:anchorId="73C9F2E9" wp14:editId="4AD0293F">
+          <wp:anchor distT="0" distB="0" distL="114300" distR="114300" simplePos="0" relativeHeight="251658240" behindDoc="1" locked="0" layoutInCell="1" allowOverlap="1" wp14:anchorId="73C9F2E9" wp14:editId="57E38D2E">
             <wp:simplePos x="0" y="0"/>
             <wp:positionH relativeFrom="margin">
               <wp:posOffset>-635</wp:posOffset>
@@ -1004,7 +1160,6 @@
     </w:p>
     <w:p>
       <w:pPr>
-        <w:jc w:val="center"/>
         <w:rPr>
           <w:rFonts w:ascii="Times New Roman" w:hAnsi="Times New Roman" w:cs="Times New Roman"/>
           <w:b/>
@@ -1013,10 +1168,7 @@
           <w:szCs w:val="32"/>
         </w:rPr>
       </w:pPr>
-    </w:p>
-    <w:p>
-      <w:pPr>
-        <w:jc w:val="center"/>
+      <w:r>
         <w:rPr>
           <w:rFonts w:ascii="Times New Roman" w:hAnsi="Times New Roman" w:cs="Times New Roman"/>
           <w:b/>
@@ -1024,8 +1176,12 @@
           <w:sz w:val="32"/>
           <w:szCs w:val="32"/>
         </w:rPr>
-      </w:pPr>
-      <w:r>
+        <w:br w:type="page"/>
+      </w:r>
+    </w:p>
+    <w:p>
+      <w:pPr>
+        <w:jc w:val="center"/>
         <w:rPr>
           <w:rFonts w:ascii="Times New Roman" w:hAnsi="Times New Roman" w:cs="Times New Roman"/>
           <w:b/>
@@ -1033,6 +1189,15 @@
           <w:sz w:val="32"/>
           <w:szCs w:val="32"/>
         </w:rPr>
+      </w:pPr>
+      <w:r>
+        <w:rPr>
+          <w:rFonts w:ascii="Times New Roman" w:hAnsi="Times New Roman" w:cs="Times New Roman"/>
+          <w:b/>
+          <w:bCs/>
+          <w:sz w:val="32"/>
+          <w:szCs w:val="32"/>
+        </w:rPr>
         <w:lastRenderedPageBreak/>
         <w:t>Chapter 2. Benefits</w:t>
       </w:r>
@@ -1961,7 +2126,7 @@
           <w:noProof/>
         </w:rPr>
         <w:drawing>
-          <wp:anchor distT="0" distB="0" distL="114300" distR="114300" simplePos="0" relativeHeight="251660288" behindDoc="1" locked="0" layoutInCell="1" allowOverlap="1" wp14:anchorId="239085BE" wp14:editId="34C6D46D">
+          <wp:anchor distT="0" distB="0" distL="114300" distR="114300" simplePos="0" relativeHeight="251660288" behindDoc="1" locked="0" layoutInCell="1" allowOverlap="1" wp14:anchorId="239085BE" wp14:editId="50CE75D0">
             <wp:simplePos x="0" y="0"/>
             <wp:positionH relativeFrom="margin">
               <wp:align>left</wp:align>
@@ -2116,12 +2281,16 @@
     </w:p>
     <w:p>
       <w:pPr>
-        <w:spacing w:line="360" w:lineRule="auto"/>
-        <w:jc w:val="both"/>
-        <w:rPr>
-          <w:rFonts w:ascii="Times New Roman" w:hAnsi="Times New Roman" w:cs="Times New Roman"/>
-        </w:rPr>
-      </w:pPr>
+        <w:rPr>
+          <w:rFonts w:ascii="Times New Roman" w:hAnsi="Times New Roman" w:cs="Times New Roman"/>
+        </w:rPr>
+      </w:pPr>
+      <w:r>
+        <w:rPr>
+          <w:rFonts w:ascii="Times New Roman" w:hAnsi="Times New Roman" w:cs="Times New Roman"/>
+        </w:rPr>
+        <w:br w:type="page"/>
+      </w:r>
     </w:p>
     <w:p>
       <w:pPr>
@@ -2576,7 +2745,21 @@
         <w:rPr>
           <w:rFonts w:ascii="Times New Roman" w:hAnsi="Times New Roman" w:cs="Times New Roman"/>
         </w:rPr>
-        <w:t>Socially, the spread of AI can also change the way people interact with each other. AI-powered chatbots and virtual assistants may make life easier, but they also risk reducing human contact. Some experts warn that as technology becomes more personal and responsive, it might replace genuine human relationships with artificial connections.</w:t>
+        <w:t xml:space="preserve">Socially, the spread of AI can also change the way people interact with each other. AI-powered chatbots and virtual assistants may make life easier, but they also risk reducing human contact. Some experts warn that as technology becomes more personal and </w:t>
+      </w:r>
+      <w:proofErr w:type="gramStart"/>
+      <w:r>
+        <w:rPr>
+          <w:rFonts w:ascii="Times New Roman" w:hAnsi="Times New Roman" w:cs="Times New Roman"/>
+        </w:rPr>
+        <w:t>responsive,</w:t>
+      </w:r>
+      <w:proofErr w:type="gramEnd"/>
+      <w:r>
+        <w:rPr>
+          <w:rFonts w:ascii="Times New Roman" w:hAnsi="Times New Roman" w:cs="Times New Roman"/>
+        </w:rPr>
+        <w:t xml:space="preserve"> it might replace genuine human relationships with artificial connections.</w:t>
       </w:r>
     </w:p>
     <w:p>
@@ -3030,12 +3213,16 @@
     </w:p>
     <w:p>
       <w:pPr>
-        <w:spacing w:line="360" w:lineRule="auto"/>
-        <w:jc w:val="both"/>
-        <w:rPr>
-          <w:rFonts w:ascii="Times New Roman" w:hAnsi="Times New Roman" w:cs="Times New Roman"/>
-        </w:rPr>
-      </w:pPr>
+        <w:rPr>
+          <w:rFonts w:ascii="Times New Roman" w:hAnsi="Times New Roman" w:cs="Times New Roman"/>
+        </w:rPr>
+      </w:pPr>
+      <w:r>
+        <w:rPr>
+          <w:rFonts w:ascii="Times New Roman" w:hAnsi="Times New Roman" w:cs="Times New Roman"/>
+        </w:rPr>
+        <w:br w:type="page"/>
+      </w:r>
     </w:p>
     <w:p>
       <w:pPr>
@@ -3873,7 +4060,6 @@
   <w:style w:type="character" w:default="1" w:styleId="DefaultParagraphFont">
     <w:name w:val="Default Paragraph Font"/>
     <w:uiPriority w:val="1"/>
-    <w:semiHidden/>
     <w:unhideWhenUsed/>
   </w:style>
   <w:style w:type="table" w:default="1" w:styleId="TableNormal">

</xml_diff>

<commit_message>
Add biography in the actual paper.
</commit_message>
<xml_diff>
--- a/Atestat.docx
+++ b/Atestat.docx
@@ -748,19 +748,7 @@
         <w:rPr>
           <w:rFonts w:ascii="Times New Roman" w:hAnsi="Times New Roman" w:cs="Times New Roman"/>
         </w:rPr>
-        <w:t xml:space="preserve"> the impact of artificial intelligence on everyday life, focusing on how modern technologies influence work, personal routines, and </w:t>
-      </w:r>
-      <w:r>
-        <w:rPr>
-          <w:rFonts w:ascii="Times New Roman" w:hAnsi="Times New Roman" w:cs="Times New Roman"/>
-        </w:rPr>
-        <w:t>society</w:t>
-      </w:r>
-      <w:r>
-        <w:rPr>
-          <w:rFonts w:ascii="Times New Roman" w:hAnsi="Times New Roman" w:cs="Times New Roman"/>
-        </w:rPr>
-        <w:t>. Its purpose is to present both the benefits and the drawbacks of artificial intelligence, offering a balanced view of its growing role in contemporary life.</w:t>
+        <w:t xml:space="preserve"> the impact of artificial intelligence on everyday life, focusing on how modern technologies influence work, personal routines, and society. Its purpose is to present both the benefits and the drawbacks of artificial intelligence, offering a balanced view of its growing role in contemporary life.</w:t>
       </w:r>
     </w:p>
     <w:p>
@@ -1095,7 +1083,7 @@
           <w:noProof/>
         </w:rPr>
         <w:drawing>
-          <wp:anchor distT="0" distB="0" distL="114300" distR="114300" simplePos="0" relativeHeight="251658240" behindDoc="1" locked="0" layoutInCell="1" allowOverlap="1" wp14:anchorId="73C9F2E9" wp14:editId="57E38D2E">
+          <wp:anchor distT="0" distB="0" distL="114300" distR="114300" simplePos="0" relativeHeight="251658240" behindDoc="1" locked="0" layoutInCell="1" allowOverlap="1" wp14:anchorId="73C9F2E9" wp14:editId="44D32547">
             <wp:simplePos x="0" y="0"/>
             <wp:positionH relativeFrom="margin">
               <wp:posOffset>-635</wp:posOffset>
@@ -3381,6 +3369,172 @@
           <w:szCs w:val="32"/>
         </w:rPr>
       </w:pPr>
+    </w:p>
+    <w:p>
+      <w:pPr>
+        <w:rPr>
+          <w:rFonts w:ascii="Times New Roman" w:hAnsi="Times New Roman" w:cs="Times New Roman"/>
+          <w:b/>
+          <w:bCs/>
+          <w:sz w:val="32"/>
+          <w:szCs w:val="32"/>
+        </w:rPr>
+      </w:pPr>
+      <w:r>
+        <w:rPr>
+          <w:rFonts w:ascii="Times New Roman" w:hAnsi="Times New Roman" w:cs="Times New Roman"/>
+          <w:b/>
+          <w:bCs/>
+          <w:sz w:val="32"/>
+          <w:szCs w:val="32"/>
+        </w:rPr>
+        <w:br w:type="page"/>
+      </w:r>
+    </w:p>
+    <w:p>
+      <w:pPr>
+        <w:jc w:val="center"/>
+        <w:rPr>
+          <w:rFonts w:ascii="Times New Roman" w:hAnsi="Times New Roman" w:cs="Times New Roman"/>
+          <w:b/>
+          <w:bCs/>
+          <w:sz w:val="32"/>
+          <w:szCs w:val="32"/>
+        </w:rPr>
+      </w:pPr>
+      <w:r>
+        <w:rPr>
+          <w:rFonts w:ascii="Times New Roman" w:hAnsi="Times New Roman" w:cs="Times New Roman"/>
+          <w:b/>
+          <w:bCs/>
+          <w:sz w:val="32"/>
+          <w:szCs w:val="32"/>
+        </w:rPr>
+        <w:lastRenderedPageBreak/>
+        <w:t>Biography</w:t>
+      </w:r>
+    </w:p>
+    <w:p>
+      <w:pPr>
+        <w:jc w:val="center"/>
+        <w:rPr>
+          <w:rFonts w:ascii="Times New Roman" w:hAnsi="Times New Roman" w:cs="Times New Roman"/>
+          <w:b/>
+          <w:bCs/>
+          <w:sz w:val="32"/>
+          <w:szCs w:val="32"/>
+        </w:rPr>
+      </w:pPr>
+    </w:p>
+    <w:p>
+      <w:pPr>
+        <w:jc w:val="center"/>
+        <w:rPr>
+          <w:rFonts w:ascii="Times New Roman" w:hAnsi="Times New Roman" w:cs="Times New Roman"/>
+          <w:b/>
+          <w:bCs/>
+          <w:sz w:val="32"/>
+          <w:szCs w:val="32"/>
+        </w:rPr>
+      </w:pPr>
+    </w:p>
+    <w:p>
+      <w:pPr>
+        <w:jc w:val="both"/>
+        <w:rPr>
+          <w:rFonts w:ascii="Times New Roman" w:hAnsi="Times New Roman" w:cs="Times New Roman"/>
+        </w:rPr>
+      </w:pPr>
+      <w:r>
+        <w:rPr>
+          <w:rFonts w:ascii="Times New Roman" w:hAnsi="Times New Roman" w:cs="Times New Roman"/>
+        </w:rPr>
+        <w:t xml:space="preserve">Fry, Hannah — Hello World: How to Be Human in the Age of the Machine, Black Swan (Transworld Publishers), London, 2018 </w:t>
+      </w:r>
+    </w:p>
+    <w:p>
+      <w:pPr>
+        <w:jc w:val="both"/>
+        <w:rPr>
+          <w:rFonts w:ascii="Times New Roman" w:hAnsi="Times New Roman" w:cs="Times New Roman"/>
+        </w:rPr>
+      </w:pPr>
+      <w:r>
+        <w:rPr>
+          <w:rFonts w:ascii="Times New Roman" w:hAnsi="Times New Roman" w:cs="Times New Roman"/>
+        </w:rPr>
+        <w:t xml:space="preserve">Tegmark, Max — Life 3.0: Being Human in the Age of Artificial Intelligence, Knopf, New York, 2017 </w:t>
+      </w:r>
+    </w:p>
+    <w:p>
+      <w:pPr>
+        <w:jc w:val="both"/>
+        <w:rPr>
+          <w:rFonts w:ascii="Times New Roman" w:hAnsi="Times New Roman" w:cs="Times New Roman"/>
+        </w:rPr>
+      </w:pPr>
+      <w:r>
+        <w:rPr>
+          <w:rFonts w:ascii="Times New Roman" w:hAnsi="Times New Roman" w:cs="Times New Roman"/>
+        </w:rPr>
+        <w:t xml:space="preserve">Bostrom, Nick — Superintelligence: Paths, Dangers, Strategies, Oxford University Press, Oxford, 2014 </w:t>
+      </w:r>
+    </w:p>
+    <w:p>
+      <w:pPr>
+        <w:jc w:val="both"/>
+        <w:rPr>
+          <w:rFonts w:ascii="Times New Roman" w:hAnsi="Times New Roman" w:cs="Times New Roman"/>
+        </w:rPr>
+      </w:pPr>
+      <w:r>
+        <w:rPr>
+          <w:rFonts w:ascii="Times New Roman" w:hAnsi="Times New Roman" w:cs="Times New Roman"/>
+        </w:rPr>
+        <w:t xml:space="preserve">Kislev, Elyakim — Relationships 5.0: How AI, VR, and Robots Will Reshape Our Emotional Lives, Oxford University Press, Oxford, 2022 </w:t>
+      </w:r>
+    </w:p>
+    <w:p>
+      <w:pPr>
+        <w:jc w:val="both"/>
+        <w:rPr>
+          <w:rFonts w:ascii="Times New Roman" w:hAnsi="Times New Roman" w:cs="Times New Roman"/>
+        </w:rPr>
+      </w:pPr>
+      <w:r>
+        <w:rPr>
+          <w:rFonts w:ascii="Times New Roman" w:hAnsi="Times New Roman" w:cs="Times New Roman"/>
+        </w:rPr>
+        <w:t xml:space="preserve">Gunkel, David J. — The Machine Question: Critical Perspectives on AI, Robots, and Ethics, MIT Press, Cambridge (MA), 2012 </w:t>
+      </w:r>
+    </w:p>
+    <w:p>
+      <w:pPr>
+        <w:jc w:val="both"/>
+        <w:rPr>
+          <w:rFonts w:ascii="Times New Roman" w:hAnsi="Times New Roman" w:cs="Times New Roman"/>
+        </w:rPr>
+      </w:pPr>
+      <w:r>
+        <w:rPr>
+          <w:rFonts w:ascii="Times New Roman" w:hAnsi="Times New Roman" w:cs="Times New Roman"/>
+        </w:rPr>
+        <w:t xml:space="preserve">Lee, Kai-Fu &amp; </w:t>
+      </w:r>
+      <w:proofErr w:type="spellStart"/>
+      <w:r>
+        <w:rPr>
+          <w:rFonts w:ascii="Times New Roman" w:hAnsi="Times New Roman" w:cs="Times New Roman"/>
+        </w:rPr>
+        <w:t>Qiufan</w:t>
+      </w:r>
+      <w:proofErr w:type="spellEnd"/>
+      <w:r>
+        <w:rPr>
+          <w:rFonts w:ascii="Times New Roman" w:hAnsi="Times New Roman" w:cs="Times New Roman"/>
+        </w:rPr>
+        <w:t>, Chen — AI 2041: Ten Visions for Our Future, (HarperCollins / unspecified in summary), (publication place — typically New York), 2021</w:t>
+      </w:r>
     </w:p>
     <w:p>
       <w:pPr>
@@ -4060,6 +4214,7 @@
   <w:style w:type="character" w:default="1" w:styleId="DefaultParagraphFont">
     <w:name w:val="Default Paragraph Font"/>
     <w:uiPriority w:val="1"/>
+    <w:semiHidden/>
     <w:unhideWhenUsed/>
   </w:style>
   <w:style w:type="table" w:default="1" w:styleId="TableNormal">

</xml_diff>

<commit_message>
Add table of contents.
</commit_message>
<xml_diff>
--- a/Atestat.docx
+++ b/Atestat.docx
@@ -13,7 +13,9 @@
           <w:szCs w:val="32"/>
         </w:rPr>
       </w:pPr>
-      <w:r>
+    </w:p>
+    <w:p>
+      <w:pPr>
         <w:rPr>
           <w:rFonts w:ascii="Times New Roman" w:hAnsi="Times New Roman" w:cs="Times New Roman"/>
           <w:b/>
@@ -21,12 +23,8 @@
           <w:sz w:val="32"/>
           <w:szCs w:val="32"/>
         </w:rPr>
-        <w:t>Argument</w:t>
-      </w:r>
-    </w:p>
-    <w:p>
-      <w:pPr>
-        <w:jc w:val="center"/>
+      </w:pPr>
+      <w:r>
         <w:rPr>
           <w:rFonts w:ascii="Times New Roman" w:hAnsi="Times New Roman" w:cs="Times New Roman"/>
           <w:b/>
@@ -34,13 +32,651 @@
           <w:sz w:val="32"/>
           <w:szCs w:val="32"/>
         </w:rPr>
-      </w:pPr>
+        <w:br w:type="page"/>
+      </w:r>
     </w:p>
     <w:p>
       <w:pPr>
         <w:jc w:val="center"/>
         <w:rPr>
           <w:rFonts w:ascii="Times New Roman" w:hAnsi="Times New Roman" w:cs="Times New Roman"/>
+          <w:b/>
+          <w:bCs/>
+          <w:sz w:val="32"/>
+          <w:szCs w:val="32"/>
+        </w:rPr>
+      </w:pPr>
+      <w:r>
+        <w:rPr>
+          <w:rFonts w:ascii="Times New Roman" w:hAnsi="Times New Roman" w:cs="Times New Roman"/>
+          <w:b/>
+          <w:bCs/>
+          <w:sz w:val="32"/>
+          <w:szCs w:val="32"/>
+        </w:rPr>
+        <w:lastRenderedPageBreak/>
+        <w:t>Table of Contents</w:t>
+      </w:r>
+    </w:p>
+    <w:p>
+      <w:pPr>
+        <w:jc w:val="center"/>
+        <w:rPr>
+          <w:rFonts w:ascii="Times New Roman" w:hAnsi="Times New Roman" w:cs="Times New Roman"/>
+          <w:b/>
+          <w:bCs/>
+          <w:sz w:val="32"/>
+          <w:szCs w:val="32"/>
+        </w:rPr>
+      </w:pPr>
+    </w:p>
+    <w:p>
+      <w:pPr>
+        <w:jc w:val="center"/>
+        <w:rPr>
+          <w:rFonts w:ascii="Times New Roman" w:hAnsi="Times New Roman" w:cs="Times New Roman"/>
+        </w:rPr>
+      </w:pPr>
+    </w:p>
+    <w:p>
+      <w:pPr>
+        <w:rPr>
+          <w:rFonts w:ascii="Times New Roman" w:hAnsi="Times New Roman" w:cs="Times New Roman"/>
+        </w:rPr>
+      </w:pPr>
+      <w:r>
+        <w:rPr>
+          <w:rFonts w:ascii="Times New Roman" w:hAnsi="Times New Roman" w:cs="Times New Roman"/>
+        </w:rPr>
+        <w:t>Argument</w:t>
+      </w:r>
+      <w:r>
+        <w:rPr>
+          <w:rFonts w:ascii="Times New Roman" w:hAnsi="Times New Roman" w:cs="Times New Roman"/>
+        </w:rPr>
+        <w:t>.....................................................................................................................................</w:t>
+      </w:r>
+      <w:r>
+        <w:rPr>
+          <w:rFonts w:ascii="Times New Roman" w:hAnsi="Times New Roman" w:cs="Times New Roman"/>
+        </w:rPr>
+        <w:t>3</w:t>
+      </w:r>
+    </w:p>
+    <w:p>
+      <w:pPr>
+        <w:rPr>
+          <w:rFonts w:ascii="Times New Roman" w:hAnsi="Times New Roman" w:cs="Times New Roman"/>
+        </w:rPr>
+      </w:pPr>
+      <w:r>
+        <w:rPr>
+          <w:rFonts w:ascii="Times New Roman" w:hAnsi="Times New Roman" w:cs="Times New Roman"/>
+        </w:rPr>
+        <w:t>Pr</w:t>
+      </w:r>
+      <w:r>
+        <w:rPr>
+          <w:rFonts w:ascii="Times New Roman" w:hAnsi="Times New Roman" w:cs="Times New Roman"/>
+        </w:rPr>
+        <w:t>é</w:t>
+      </w:r>
+      <w:r>
+        <w:rPr>
+          <w:rFonts w:ascii="Times New Roman" w:hAnsi="Times New Roman" w:cs="Times New Roman"/>
+        </w:rPr>
+        <w:t>cis</w:t>
+      </w:r>
+      <w:r>
+        <w:rPr>
+          <w:rFonts w:ascii="Times New Roman" w:hAnsi="Times New Roman" w:cs="Times New Roman"/>
+        </w:rPr>
+        <w:t>...........................................................................................................................................</w:t>
+      </w:r>
+      <w:r>
+        <w:rPr>
+          <w:rFonts w:ascii="Times New Roman" w:hAnsi="Times New Roman" w:cs="Times New Roman"/>
+        </w:rPr>
+        <w:t>4</w:t>
+      </w:r>
+    </w:p>
+    <w:p>
+      <w:pPr>
+        <w:rPr>
+          <w:rFonts w:ascii="Times New Roman" w:hAnsi="Times New Roman" w:cs="Times New Roman"/>
+        </w:rPr>
+      </w:pPr>
+      <w:r>
+        <w:rPr>
+          <w:rFonts w:ascii="Times New Roman" w:hAnsi="Times New Roman" w:cs="Times New Roman"/>
+        </w:rPr>
+        <w:t>Chapter 1 – Introduction</w:t>
+      </w:r>
+      <w:r>
+        <w:rPr>
+          <w:rFonts w:ascii="Times New Roman" w:hAnsi="Times New Roman" w:cs="Times New Roman"/>
+        </w:rPr>
+        <w:t>.............................................................................................................</w:t>
+      </w:r>
+      <w:r>
+        <w:rPr>
+          <w:rFonts w:ascii="Times New Roman" w:hAnsi="Times New Roman" w:cs="Times New Roman"/>
+        </w:rPr>
+        <w:t>5</w:t>
+      </w:r>
+    </w:p>
+    <w:p>
+      <w:pPr>
+        <w:rPr>
+          <w:rFonts w:ascii="Times New Roman" w:hAnsi="Times New Roman" w:cs="Times New Roman"/>
+        </w:rPr>
+      </w:pPr>
+      <w:r>
+        <w:rPr>
+          <w:rFonts w:ascii="Times New Roman" w:hAnsi="Times New Roman" w:cs="Times New Roman"/>
+        </w:rPr>
+        <w:t xml:space="preserve">Chapter </w:t>
+      </w:r>
+      <w:r>
+        <w:rPr>
+          <w:rFonts w:ascii="Times New Roman" w:hAnsi="Times New Roman" w:cs="Times New Roman"/>
+        </w:rPr>
+        <w:t>2</w:t>
+      </w:r>
+      <w:r>
+        <w:rPr>
+          <w:rFonts w:ascii="Times New Roman" w:hAnsi="Times New Roman" w:cs="Times New Roman"/>
+        </w:rPr>
+        <w:t xml:space="preserve"> – </w:t>
+      </w:r>
+      <w:r>
+        <w:rPr>
+          <w:rFonts w:ascii="Times New Roman" w:hAnsi="Times New Roman" w:cs="Times New Roman"/>
+        </w:rPr>
+        <w:t>Benefits</w:t>
+      </w:r>
+      <w:r>
+        <w:rPr>
+          <w:rFonts w:ascii="Times New Roman" w:hAnsi="Times New Roman" w:cs="Times New Roman"/>
+        </w:rPr>
+        <w:t>....................................................................................................................</w:t>
+      </w:r>
+      <w:r>
+        <w:rPr>
+          <w:rFonts w:ascii="Times New Roman" w:hAnsi="Times New Roman" w:cs="Times New Roman"/>
+        </w:rPr>
+        <w:t>6</w:t>
+      </w:r>
+    </w:p>
+    <w:p>
+      <w:pPr>
+        <w:rPr>
+          <w:rFonts w:ascii="Times New Roman" w:hAnsi="Times New Roman" w:cs="Times New Roman"/>
+        </w:rPr>
+      </w:pPr>
+      <w:r>
+        <w:rPr>
+          <w:rFonts w:ascii="Times New Roman" w:hAnsi="Times New Roman" w:cs="Times New Roman"/>
+        </w:rPr>
+        <w:tab/>
+      </w:r>
+      <w:r>
+        <w:rPr>
+          <w:rFonts w:ascii="Times New Roman" w:hAnsi="Times New Roman" w:cs="Times New Roman"/>
+        </w:rPr>
+        <w:t>2.1 Transforming Work Life</w:t>
+      </w:r>
+      <w:r>
+        <w:rPr>
+          <w:rFonts w:ascii="Times New Roman" w:hAnsi="Times New Roman" w:cs="Times New Roman"/>
+        </w:rPr>
+        <w:t>............................................................................................</w:t>
+      </w:r>
+      <w:r>
+        <w:rPr>
+          <w:rFonts w:ascii="Times New Roman" w:hAnsi="Times New Roman" w:cs="Times New Roman"/>
+        </w:rPr>
+        <w:t>6</w:t>
+      </w:r>
+    </w:p>
+    <w:p>
+      <w:pPr>
+        <w:rPr>
+          <w:rFonts w:ascii="Times New Roman" w:hAnsi="Times New Roman" w:cs="Times New Roman"/>
+        </w:rPr>
+      </w:pPr>
+      <w:r>
+        <w:rPr>
+          <w:rFonts w:ascii="Times New Roman" w:hAnsi="Times New Roman" w:cs="Times New Roman"/>
+        </w:rPr>
+        <w:tab/>
+      </w:r>
+      <w:r>
+        <w:rPr>
+          <w:rFonts w:ascii="Times New Roman" w:hAnsi="Times New Roman" w:cs="Times New Roman"/>
+        </w:rPr>
+        <w:t>2.2 Enhancing Personal Life</w:t>
+      </w:r>
+      <w:r>
+        <w:rPr>
+          <w:rFonts w:ascii="Times New Roman" w:hAnsi="Times New Roman" w:cs="Times New Roman"/>
+        </w:rPr>
+        <w:t>...........................................................................................</w:t>
+      </w:r>
+      <w:r>
+        <w:rPr>
+          <w:rFonts w:ascii="Times New Roman" w:hAnsi="Times New Roman" w:cs="Times New Roman"/>
+        </w:rPr>
+        <w:t>6</w:t>
+      </w:r>
+    </w:p>
+    <w:p>
+      <w:pPr>
+        <w:rPr>
+          <w:rFonts w:ascii="Times New Roman" w:hAnsi="Times New Roman" w:cs="Times New Roman"/>
+        </w:rPr>
+      </w:pPr>
+      <w:r>
+        <w:rPr>
+          <w:rFonts w:ascii="Times New Roman" w:hAnsi="Times New Roman" w:cs="Times New Roman"/>
+        </w:rPr>
+        <w:tab/>
+      </w:r>
+      <w:r>
+        <w:rPr>
+          <w:rFonts w:ascii="Times New Roman" w:hAnsi="Times New Roman" w:cs="Times New Roman"/>
+        </w:rPr>
+        <w:t>2.3 Healthcare and Wellbeing</w:t>
+      </w:r>
+      <w:r>
+        <w:rPr>
+          <w:rFonts w:ascii="Times New Roman" w:hAnsi="Times New Roman" w:cs="Times New Roman"/>
+        </w:rPr>
+        <w:t>..........................................................................................</w:t>
+      </w:r>
+      <w:r>
+        <w:rPr>
+          <w:rFonts w:ascii="Times New Roman" w:hAnsi="Times New Roman" w:cs="Times New Roman"/>
+        </w:rPr>
+        <w:t>7</w:t>
+      </w:r>
+    </w:p>
+    <w:p>
+      <w:pPr>
+        <w:rPr>
+          <w:rFonts w:ascii="Times New Roman" w:hAnsi="Times New Roman" w:cs="Times New Roman"/>
+        </w:rPr>
+      </w:pPr>
+      <w:r>
+        <w:rPr>
+          <w:rFonts w:ascii="Times New Roman" w:hAnsi="Times New Roman" w:cs="Times New Roman"/>
+        </w:rPr>
+        <w:tab/>
+      </w:r>
+      <w:r>
+        <w:rPr>
+          <w:rFonts w:ascii="Times New Roman" w:hAnsi="Times New Roman" w:cs="Times New Roman"/>
+        </w:rPr>
+        <w:t>2.4 Smart Cities and Urban Living</w:t>
+      </w:r>
+      <w:r>
+        <w:rPr>
+          <w:rFonts w:ascii="Times New Roman" w:hAnsi="Times New Roman" w:cs="Times New Roman"/>
+        </w:rPr>
+        <w:t>..................................................................................</w:t>
+      </w:r>
+      <w:r>
+        <w:rPr>
+          <w:rFonts w:ascii="Times New Roman" w:hAnsi="Times New Roman" w:cs="Times New Roman"/>
+        </w:rPr>
+        <w:t>7</w:t>
+      </w:r>
+    </w:p>
+    <w:p>
+      <w:pPr>
+        <w:rPr>
+          <w:rFonts w:ascii="Times New Roman" w:hAnsi="Times New Roman" w:cs="Times New Roman"/>
+        </w:rPr>
+      </w:pPr>
+      <w:r>
+        <w:rPr>
+          <w:rFonts w:ascii="Times New Roman" w:hAnsi="Times New Roman" w:cs="Times New Roman"/>
+        </w:rPr>
+        <w:tab/>
+      </w:r>
+      <w:r>
+        <w:rPr>
+          <w:rFonts w:ascii="Times New Roman" w:hAnsi="Times New Roman" w:cs="Times New Roman"/>
+        </w:rPr>
+        <w:t>2.5 Benefits for Society as a Whole</w:t>
+      </w:r>
+      <w:r>
+        <w:rPr>
+          <w:rFonts w:ascii="Times New Roman" w:hAnsi="Times New Roman" w:cs="Times New Roman"/>
+        </w:rPr>
+        <w:t>................................................................................</w:t>
+      </w:r>
+      <w:r>
+        <w:rPr>
+          <w:rFonts w:ascii="Times New Roman" w:hAnsi="Times New Roman" w:cs="Times New Roman"/>
+        </w:rPr>
+        <w:t>8</w:t>
+      </w:r>
+    </w:p>
+    <w:p>
+      <w:pPr>
+        <w:rPr>
+          <w:rFonts w:ascii="Times New Roman" w:hAnsi="Times New Roman" w:cs="Times New Roman"/>
+        </w:rPr>
+      </w:pPr>
+      <w:r>
+        <w:rPr>
+          <w:rFonts w:ascii="Times New Roman" w:hAnsi="Times New Roman" w:cs="Times New Roman"/>
+        </w:rPr>
+        <w:tab/>
+      </w:r>
+      <w:r>
+        <w:rPr>
+          <w:rFonts w:ascii="Times New Roman" w:hAnsi="Times New Roman" w:cs="Times New Roman"/>
+        </w:rPr>
+        <w:t>2.6 Looking Ahead</w:t>
+      </w:r>
+      <w:r>
+        <w:rPr>
+          <w:rFonts w:ascii="Times New Roman" w:hAnsi="Times New Roman" w:cs="Times New Roman"/>
+        </w:rPr>
+        <w:t>..........................................................................................................</w:t>
+      </w:r>
+      <w:r>
+        <w:rPr>
+          <w:rFonts w:ascii="Times New Roman" w:hAnsi="Times New Roman" w:cs="Times New Roman"/>
+        </w:rPr>
+        <w:t>9</w:t>
+      </w:r>
+    </w:p>
+    <w:p>
+      <w:pPr>
+        <w:rPr>
+          <w:rFonts w:ascii="Times New Roman" w:hAnsi="Times New Roman" w:cs="Times New Roman"/>
+        </w:rPr>
+      </w:pPr>
+      <w:r>
+        <w:rPr>
+          <w:rFonts w:ascii="Times New Roman" w:hAnsi="Times New Roman" w:cs="Times New Roman"/>
+        </w:rPr>
+        <w:t>Chapter 3 – Drawbacks</w:t>
+      </w:r>
+      <w:r>
+        <w:rPr>
+          <w:rFonts w:ascii="Times New Roman" w:hAnsi="Times New Roman" w:cs="Times New Roman"/>
+        </w:rPr>
+        <w:t>.............................................................................................................</w:t>
+      </w:r>
+      <w:r>
+        <w:rPr>
+          <w:rFonts w:ascii="Times New Roman" w:hAnsi="Times New Roman" w:cs="Times New Roman"/>
+        </w:rPr>
+        <w:t>10</w:t>
+      </w:r>
+    </w:p>
+    <w:p>
+      <w:pPr>
+        <w:rPr>
+          <w:rFonts w:ascii="Times New Roman" w:hAnsi="Times New Roman" w:cs="Times New Roman"/>
+        </w:rPr>
+      </w:pPr>
+      <w:r>
+        <w:rPr>
+          <w:rFonts w:ascii="Times New Roman" w:hAnsi="Times New Roman" w:cs="Times New Roman"/>
+        </w:rPr>
+        <w:tab/>
+      </w:r>
+      <w:r>
+        <w:rPr>
+          <w:rFonts w:ascii="Times New Roman" w:hAnsi="Times New Roman" w:cs="Times New Roman"/>
+        </w:rPr>
+        <w:t>3.1 Job Loss and Economical Inequality</w:t>
+      </w:r>
+      <w:r>
+        <w:rPr>
+          <w:rFonts w:ascii="Times New Roman" w:hAnsi="Times New Roman" w:cs="Times New Roman"/>
+        </w:rPr>
+        <w:t>.......................................................................</w:t>
+      </w:r>
+      <w:r>
+        <w:rPr>
+          <w:rFonts w:ascii="Times New Roman" w:hAnsi="Times New Roman" w:cs="Times New Roman"/>
+        </w:rPr>
+        <w:t>1</w:t>
+      </w:r>
+      <w:r>
+        <w:rPr>
+          <w:rFonts w:ascii="Times New Roman" w:hAnsi="Times New Roman" w:cs="Times New Roman"/>
+        </w:rPr>
+        <w:t>0</w:t>
+      </w:r>
+    </w:p>
+    <w:p>
+      <w:pPr>
+        <w:rPr>
+          <w:rFonts w:ascii="Times New Roman" w:hAnsi="Times New Roman" w:cs="Times New Roman"/>
+        </w:rPr>
+      </w:pPr>
+      <w:r>
+        <w:rPr>
+          <w:rFonts w:ascii="Times New Roman" w:hAnsi="Times New Roman" w:cs="Times New Roman"/>
+        </w:rPr>
+        <w:tab/>
+      </w:r>
+      <w:r>
+        <w:rPr>
+          <w:rFonts w:ascii="Times New Roman" w:hAnsi="Times New Roman" w:cs="Times New Roman"/>
+        </w:rPr>
+        <w:t>3.2 Privacy and Surveillance</w:t>
+      </w:r>
+      <w:r>
+        <w:rPr>
+          <w:rFonts w:ascii="Times New Roman" w:hAnsi="Times New Roman" w:cs="Times New Roman"/>
+        </w:rPr>
+        <w:t>.........................................................................................</w:t>
+      </w:r>
+      <w:r>
+        <w:rPr>
+          <w:rFonts w:ascii="Times New Roman" w:hAnsi="Times New Roman" w:cs="Times New Roman"/>
+        </w:rPr>
+        <w:t>10</w:t>
+      </w:r>
+    </w:p>
+    <w:p>
+      <w:pPr>
+        <w:ind w:firstLine="708"/>
+        <w:rPr>
+          <w:rFonts w:ascii="Times New Roman" w:hAnsi="Times New Roman" w:cs="Times New Roman"/>
+        </w:rPr>
+      </w:pPr>
+      <w:r>
+        <w:rPr>
+          <w:rFonts w:ascii="Times New Roman" w:hAnsi="Times New Roman" w:cs="Times New Roman"/>
+        </w:rPr>
+        <w:t>3.3 Dependence on Technology</w:t>
+      </w:r>
+      <w:r>
+        <w:rPr>
+          <w:rFonts w:ascii="Times New Roman" w:hAnsi="Times New Roman" w:cs="Times New Roman"/>
+        </w:rPr>
+        <w:t>.....................................................................................</w:t>
+      </w:r>
+      <w:r>
+        <w:rPr>
+          <w:rFonts w:ascii="Times New Roman" w:hAnsi="Times New Roman" w:cs="Times New Roman"/>
+        </w:rPr>
+        <w:t>11</w:t>
+      </w:r>
+    </w:p>
+    <w:p>
+      <w:pPr>
+        <w:ind w:firstLine="708"/>
+        <w:rPr>
+          <w:rFonts w:ascii="Times New Roman" w:hAnsi="Times New Roman" w:cs="Times New Roman"/>
+        </w:rPr>
+      </w:pPr>
+      <w:r>
+        <w:rPr>
+          <w:rFonts w:ascii="Times New Roman" w:hAnsi="Times New Roman" w:cs="Times New Roman"/>
+        </w:rPr>
+        <w:t>3.4 Ethical and Social Challenges</w:t>
+      </w:r>
+      <w:r>
+        <w:rPr>
+          <w:rFonts w:ascii="Times New Roman" w:hAnsi="Times New Roman" w:cs="Times New Roman"/>
+        </w:rPr>
+        <w:t>.................................................................................</w:t>
+      </w:r>
+      <w:r>
+        <w:rPr>
+          <w:rFonts w:ascii="Times New Roman" w:hAnsi="Times New Roman" w:cs="Times New Roman"/>
+        </w:rPr>
+        <w:t>11</w:t>
+      </w:r>
+    </w:p>
+    <w:p>
+      <w:pPr>
+        <w:rPr>
+          <w:rFonts w:ascii="Times New Roman" w:hAnsi="Times New Roman" w:cs="Times New Roman"/>
+        </w:rPr>
+      </w:pPr>
+      <w:r>
+        <w:rPr>
+          <w:rFonts w:ascii="Times New Roman" w:hAnsi="Times New Roman" w:cs="Times New Roman"/>
+        </w:rPr>
+        <w:tab/>
+      </w:r>
+      <w:r>
+        <w:rPr>
+          <w:rFonts w:ascii="Times New Roman" w:hAnsi="Times New Roman" w:cs="Times New Roman"/>
+        </w:rPr>
+        <w:t>3.5 Environmental Costs</w:t>
+      </w:r>
+      <w:r>
+        <w:rPr>
+          <w:rFonts w:ascii="Times New Roman" w:hAnsi="Times New Roman" w:cs="Times New Roman"/>
+        </w:rPr>
+        <w:t>...............................................................................................</w:t>
+      </w:r>
+      <w:r>
+        <w:rPr>
+          <w:rFonts w:ascii="Times New Roman" w:hAnsi="Times New Roman" w:cs="Times New Roman"/>
+        </w:rPr>
+        <w:t>12</w:t>
+      </w:r>
+    </w:p>
+    <w:p>
+      <w:pPr>
+        <w:rPr>
+          <w:rFonts w:ascii="Times New Roman" w:hAnsi="Times New Roman" w:cs="Times New Roman"/>
+        </w:rPr>
+      </w:pPr>
+      <w:r>
+        <w:rPr>
+          <w:rFonts w:ascii="Times New Roman" w:hAnsi="Times New Roman" w:cs="Times New Roman"/>
+        </w:rPr>
+        <w:tab/>
+      </w:r>
+      <w:r>
+        <w:rPr>
+          <w:rFonts w:ascii="Times New Roman" w:hAnsi="Times New Roman" w:cs="Times New Roman"/>
+        </w:rPr>
+        <w:t>3.6 Looking Ahead</w:t>
+      </w:r>
+      <w:r>
+        <w:rPr>
+          <w:rFonts w:ascii="Times New Roman" w:hAnsi="Times New Roman" w:cs="Times New Roman"/>
+        </w:rPr>
+        <w:t>........................................................................................................</w:t>
+      </w:r>
+      <w:r>
+        <w:rPr>
+          <w:rFonts w:ascii="Times New Roman" w:hAnsi="Times New Roman" w:cs="Times New Roman"/>
+        </w:rPr>
+        <w:t>12</w:t>
+      </w:r>
+    </w:p>
+    <w:p>
+      <w:pPr>
+        <w:rPr>
+          <w:rFonts w:ascii="Times New Roman" w:hAnsi="Times New Roman" w:cs="Times New Roman"/>
+        </w:rPr>
+      </w:pPr>
+      <w:r>
+        <w:rPr>
+          <w:rFonts w:ascii="Times New Roman" w:hAnsi="Times New Roman" w:cs="Times New Roman"/>
+        </w:rPr>
+        <w:t>Conclusion</w:t>
+      </w:r>
+      <w:r>
+        <w:rPr>
+          <w:rFonts w:ascii="Times New Roman" w:hAnsi="Times New Roman" w:cs="Times New Roman"/>
+        </w:rPr>
+        <w:t>................................................................................................................................</w:t>
+      </w:r>
+      <w:r>
+        <w:rPr>
+          <w:rFonts w:ascii="Times New Roman" w:hAnsi="Times New Roman" w:cs="Times New Roman"/>
+        </w:rPr>
+        <w:t>14</w:t>
+      </w:r>
+    </w:p>
+    <w:p>
+      <w:pPr>
+        <w:rPr>
+          <w:rFonts w:ascii="Times New Roman" w:hAnsi="Times New Roman" w:cs="Times New Roman"/>
+        </w:rPr>
+      </w:pPr>
+      <w:r>
+        <w:rPr>
+          <w:rFonts w:ascii="Times New Roman" w:hAnsi="Times New Roman" w:cs="Times New Roman"/>
+        </w:rPr>
+        <w:t>Biography</w:t>
+      </w:r>
+      <w:r>
+        <w:rPr>
+          <w:rFonts w:ascii="Times New Roman" w:hAnsi="Times New Roman" w:cs="Times New Roman"/>
+        </w:rPr>
+        <w:t>..................................................................................................................................</w:t>
+      </w:r>
+      <w:r>
+        <w:rPr>
+          <w:rFonts w:ascii="Times New Roman" w:hAnsi="Times New Roman" w:cs="Times New Roman"/>
+        </w:rPr>
+        <w:t>15</w:t>
+      </w:r>
+    </w:p>
+    <w:p>
+      <w:pPr>
+        <w:jc w:val="center"/>
+        <w:rPr>
+          <w:rFonts w:ascii="Times New Roman" w:hAnsi="Times New Roman" w:cs="Times New Roman"/>
+          <w:b/>
+          <w:bCs/>
+          <w:sz w:val="32"/>
+          <w:szCs w:val="32"/>
+        </w:rPr>
+      </w:pPr>
+    </w:p>
+    <w:p>
+      <w:pPr>
+        <w:rPr>
+          <w:rFonts w:ascii="Times New Roman" w:hAnsi="Times New Roman" w:cs="Times New Roman"/>
+        </w:rPr>
+      </w:pPr>
+    </w:p>
+    <w:p>
+      <w:pPr>
+        <w:spacing w:line="360" w:lineRule="auto"/>
+        <w:rPr>
+          <w:rFonts w:ascii="Times New Roman" w:hAnsi="Times New Roman" w:cs="Times New Roman"/>
+          <w:b/>
+          <w:bCs/>
           <w:sz w:val="28"/>
           <w:szCs w:val="28"/>
         </w:rPr>
@@ -49,643 +685,16 @@
     <w:p>
       <w:pPr>
         <w:spacing w:line="360" w:lineRule="auto"/>
-        <w:jc w:val="both"/>
-        <w:rPr>
-          <w:rFonts w:ascii="Times New Roman" w:hAnsi="Times New Roman" w:cs="Times New Roman"/>
-        </w:rPr>
-      </w:pPr>
-      <w:r>
-        <w:rPr>
-          <w:rFonts w:ascii="Times New Roman" w:hAnsi="Times New Roman" w:cs="Times New Roman"/>
-        </w:rPr>
-        <w:t>Ever since I was a teenager, I’ve caught myself daydreaming about the future</w:t>
-      </w:r>
-      <w:r>
-        <w:rPr>
-          <w:rFonts w:ascii="Times New Roman" w:hAnsi="Times New Roman" w:cs="Times New Roman"/>
-        </w:rPr>
-        <w:t xml:space="preserve"> </w:t>
-      </w:r>
-      <w:r>
-        <w:rPr>
-          <w:rFonts w:ascii="Times New Roman" w:hAnsi="Times New Roman" w:cs="Times New Roman"/>
-        </w:rPr>
-        <w:t>—</w:t>
-      </w:r>
-      <w:r>
-        <w:rPr>
-          <w:rFonts w:ascii="Times New Roman" w:hAnsi="Times New Roman" w:cs="Times New Roman"/>
-        </w:rPr>
-        <w:t xml:space="preserve"> </w:t>
-      </w:r>
-      <w:r>
-        <w:rPr>
-          <w:rFonts w:ascii="Times New Roman" w:hAnsi="Times New Roman" w:cs="Times New Roman"/>
-        </w:rPr>
-        <w:t xml:space="preserve">wondering what life might look like, what crazy inventions might </w:t>
-      </w:r>
-      <w:r>
-        <w:rPr>
-          <w:rFonts w:ascii="Times New Roman" w:hAnsi="Times New Roman" w:cs="Times New Roman"/>
-        </w:rPr>
-        <w:t>catch</w:t>
-      </w:r>
-      <w:r>
-        <w:rPr>
-          <w:rFonts w:ascii="Times New Roman" w:hAnsi="Times New Roman" w:cs="Times New Roman"/>
-        </w:rPr>
-        <w:t xml:space="preserve"> on, and which ones we</w:t>
-      </w:r>
-      <w:r>
-        <w:rPr>
-          <w:rFonts w:ascii="Times New Roman" w:hAnsi="Times New Roman" w:cs="Times New Roman"/>
-        </w:rPr>
-        <w:t xml:space="preserve"> wi</w:t>
-      </w:r>
-      <w:r>
-        <w:rPr>
-          <w:rFonts w:ascii="Times New Roman" w:hAnsi="Times New Roman" w:cs="Times New Roman"/>
-        </w:rPr>
-        <w:t>ll laugh about later. Out of everything, artificial intelligence has probably been the one thing I ke</w:t>
-      </w:r>
-      <w:r>
-        <w:rPr>
-          <w:rFonts w:ascii="Times New Roman" w:hAnsi="Times New Roman" w:cs="Times New Roman"/>
-        </w:rPr>
-        <w:t>pt</w:t>
-      </w:r>
-      <w:r>
-        <w:rPr>
-          <w:rFonts w:ascii="Times New Roman" w:hAnsi="Times New Roman" w:cs="Times New Roman"/>
-        </w:rPr>
-        <w:t xml:space="preserve"> coming back to. It</w:t>
-      </w:r>
-      <w:r>
-        <w:rPr>
-          <w:rFonts w:ascii="Times New Roman" w:hAnsi="Times New Roman" w:cs="Times New Roman"/>
-        </w:rPr>
-        <w:t xml:space="preserve"> i</w:t>
-      </w:r>
-      <w:r>
-        <w:rPr>
-          <w:rFonts w:ascii="Times New Roman" w:hAnsi="Times New Roman" w:cs="Times New Roman"/>
-        </w:rPr>
-        <w:t xml:space="preserve">s not just something out of sci-fi </w:t>
-      </w:r>
-      <w:r>
-        <w:rPr>
-          <w:rFonts w:ascii="Times New Roman" w:hAnsi="Times New Roman" w:cs="Times New Roman"/>
-        </w:rPr>
-        <w:t xml:space="preserve">anymore, </w:t>
-      </w:r>
-      <w:r>
-        <w:rPr>
-          <w:rFonts w:ascii="Times New Roman" w:hAnsi="Times New Roman" w:cs="Times New Roman"/>
-        </w:rPr>
-        <w:t>it</w:t>
-      </w:r>
-      <w:r>
-        <w:rPr>
-          <w:rFonts w:ascii="Times New Roman" w:hAnsi="Times New Roman" w:cs="Times New Roman"/>
-        </w:rPr>
-        <w:t xml:space="preserve"> i</w:t>
-      </w:r>
-      <w:r>
-        <w:rPr>
-          <w:rFonts w:ascii="Times New Roman" w:hAnsi="Times New Roman" w:cs="Times New Roman"/>
-        </w:rPr>
-        <w:t>s in our phones, our homes, and even quietly influencing decisions we do</w:t>
-      </w:r>
-      <w:r>
-        <w:rPr>
-          <w:rFonts w:ascii="Times New Roman" w:hAnsi="Times New Roman" w:cs="Times New Roman"/>
-        </w:rPr>
-        <w:t xml:space="preserve"> </w:t>
-      </w:r>
-      <w:r>
-        <w:rPr>
-          <w:rFonts w:ascii="Times New Roman" w:hAnsi="Times New Roman" w:cs="Times New Roman"/>
-        </w:rPr>
-        <w:t>n</w:t>
-      </w:r>
-      <w:r>
-        <w:rPr>
-          <w:rFonts w:ascii="Times New Roman" w:hAnsi="Times New Roman" w:cs="Times New Roman"/>
-        </w:rPr>
-        <w:t>o</w:t>
-      </w:r>
-      <w:r>
-        <w:rPr>
-          <w:rFonts w:ascii="Times New Roman" w:hAnsi="Times New Roman" w:cs="Times New Roman"/>
-        </w:rPr>
-        <w:t>t</w:t>
-      </w:r>
-      <w:r>
-        <w:rPr>
-          <w:rFonts w:ascii="Times New Roman" w:hAnsi="Times New Roman" w:cs="Times New Roman"/>
-        </w:rPr>
-        <w:t xml:space="preserve"> even</w:t>
-      </w:r>
-      <w:r>
-        <w:rPr>
-          <w:rFonts w:ascii="Times New Roman" w:hAnsi="Times New Roman" w:cs="Times New Roman"/>
-        </w:rPr>
-        <w:t xml:space="preserve"> realize we</w:t>
-      </w:r>
-      <w:r>
-        <w:rPr>
-          <w:rFonts w:ascii="Times New Roman" w:hAnsi="Times New Roman" w:cs="Times New Roman"/>
-        </w:rPr>
-        <w:t xml:space="preserve"> a</w:t>
-      </w:r>
-      <w:r>
-        <w:rPr>
-          <w:rFonts w:ascii="Times New Roman" w:hAnsi="Times New Roman" w:cs="Times New Roman"/>
-        </w:rPr>
-        <w:t>re making.</w:t>
-      </w:r>
-    </w:p>
-    <w:p>
-      <w:pPr>
-        <w:spacing w:line="360" w:lineRule="auto"/>
-        <w:jc w:val="both"/>
-        <w:rPr>
-          <w:rFonts w:ascii="Times New Roman" w:hAnsi="Times New Roman" w:cs="Times New Roman"/>
-        </w:rPr>
-      </w:pPr>
-      <w:r>
-        <w:rPr>
-          <w:rFonts w:ascii="Times New Roman" w:hAnsi="Times New Roman" w:cs="Times New Roman"/>
-        </w:rPr>
-        <w:t>I believe my interest in AI began after I read an article about self-driving cars. The idea that a machine could make split-second decisions on the road without a human behind the wheel honestly blew my mind</w:t>
-      </w:r>
-      <w:r>
-        <w:rPr>
-          <w:rFonts w:ascii="Times New Roman" w:hAnsi="Times New Roman" w:cs="Times New Roman"/>
-        </w:rPr>
-        <w:t xml:space="preserve"> because of how shocking this whole concept is</w:t>
-      </w:r>
-      <w:r>
-        <w:rPr>
-          <w:rFonts w:ascii="Times New Roman" w:hAnsi="Times New Roman" w:cs="Times New Roman"/>
-        </w:rPr>
-        <w:t xml:space="preserve">. After that, I started </w:t>
-      </w:r>
-      <w:r>
-        <w:rPr>
-          <w:rFonts w:ascii="Times New Roman" w:hAnsi="Times New Roman" w:cs="Times New Roman"/>
-        </w:rPr>
-        <w:t>noticing</w:t>
-      </w:r>
-      <w:r>
-        <w:rPr>
-          <w:rFonts w:ascii="Times New Roman" w:hAnsi="Times New Roman" w:cs="Times New Roman"/>
-        </w:rPr>
-        <w:t xml:space="preserve"> AI everywhere</w:t>
-      </w:r>
-      <w:r>
-        <w:rPr>
-          <w:rFonts w:ascii="Times New Roman" w:hAnsi="Times New Roman" w:cs="Times New Roman"/>
-        </w:rPr>
-        <w:t xml:space="preserve"> </w:t>
-      </w:r>
-      <w:r>
-        <w:rPr>
-          <w:rFonts w:ascii="Times New Roman" w:hAnsi="Times New Roman" w:cs="Times New Roman"/>
-        </w:rPr>
-        <w:t>—</w:t>
-      </w:r>
-      <w:r>
-        <w:rPr>
-          <w:rFonts w:ascii="Times New Roman" w:hAnsi="Times New Roman" w:cs="Times New Roman"/>
-        </w:rPr>
-        <w:t xml:space="preserve"> </w:t>
-      </w:r>
-      <w:r>
-        <w:rPr>
-          <w:rFonts w:ascii="Times New Roman" w:hAnsi="Times New Roman" w:cs="Times New Roman"/>
-        </w:rPr>
-        <w:t>in phone recommendations, in ads that weirdly seemed to know</w:t>
-      </w:r>
-      <w:r>
-        <w:rPr>
-          <w:rFonts w:ascii="Times New Roman" w:hAnsi="Times New Roman" w:cs="Times New Roman"/>
-        </w:rPr>
-        <w:t xml:space="preserve"> exactly</w:t>
-      </w:r>
-      <w:r>
-        <w:rPr>
-          <w:rFonts w:ascii="Times New Roman" w:hAnsi="Times New Roman" w:cs="Times New Roman"/>
-        </w:rPr>
-        <w:t xml:space="preserve"> what </w:t>
-      </w:r>
-      <w:r>
-        <w:rPr>
-          <w:rFonts w:ascii="Times New Roman" w:hAnsi="Times New Roman" w:cs="Times New Roman"/>
-        </w:rPr>
-        <w:t>we</w:t>
-      </w:r>
-      <w:r>
-        <w:rPr>
-          <w:rFonts w:ascii="Times New Roman" w:hAnsi="Times New Roman" w:cs="Times New Roman"/>
-        </w:rPr>
-        <w:t xml:space="preserve"> </w:t>
-      </w:r>
-      <w:r>
-        <w:rPr>
-          <w:rFonts w:ascii="Times New Roman" w:hAnsi="Times New Roman" w:cs="Times New Roman"/>
-        </w:rPr>
-        <w:t>are</w:t>
-      </w:r>
-      <w:r>
-        <w:rPr>
-          <w:rFonts w:ascii="Times New Roman" w:hAnsi="Times New Roman" w:cs="Times New Roman"/>
-        </w:rPr>
-        <w:t xml:space="preserve"> thinking about. That</w:t>
-      </w:r>
-      <w:r>
-        <w:rPr>
-          <w:rFonts w:ascii="Times New Roman" w:hAnsi="Times New Roman" w:cs="Times New Roman"/>
-        </w:rPr>
-        <w:t xml:space="preserve"> i</w:t>
-      </w:r>
-      <w:r>
-        <w:rPr>
-          <w:rFonts w:ascii="Times New Roman" w:hAnsi="Times New Roman" w:cs="Times New Roman"/>
-        </w:rPr>
-        <w:t>s when it hit me: AI is</w:t>
-      </w:r>
-      <w:r>
-        <w:rPr>
-          <w:rFonts w:ascii="Times New Roman" w:hAnsi="Times New Roman" w:cs="Times New Roman"/>
-        </w:rPr>
-        <w:t xml:space="preserve"> </w:t>
-      </w:r>
-      <w:r>
-        <w:rPr>
-          <w:rFonts w:ascii="Times New Roman" w:hAnsi="Times New Roman" w:cs="Times New Roman"/>
-        </w:rPr>
-        <w:t>n</w:t>
-      </w:r>
-      <w:r>
-        <w:rPr>
-          <w:rFonts w:ascii="Times New Roman" w:hAnsi="Times New Roman" w:cs="Times New Roman"/>
-        </w:rPr>
-        <w:t>o</w:t>
-      </w:r>
-      <w:r>
-        <w:rPr>
-          <w:rFonts w:ascii="Times New Roman" w:hAnsi="Times New Roman" w:cs="Times New Roman"/>
-        </w:rPr>
-        <w:t>t just about robots or futuristic tech. It’s already woven into our daily lives.</w:t>
-      </w:r>
-    </w:p>
-    <w:p>
-      <w:pPr>
-        <w:spacing w:line="360" w:lineRule="auto"/>
-        <w:jc w:val="both"/>
-        <w:rPr>
-          <w:rFonts w:ascii="Times New Roman" w:hAnsi="Times New Roman" w:cs="Times New Roman"/>
-        </w:rPr>
-      </w:pPr>
-      <w:r>
-        <w:rPr>
-          <w:rFonts w:ascii="Times New Roman" w:hAnsi="Times New Roman" w:cs="Times New Roman"/>
-        </w:rPr>
-        <w:t>One of the reasons I picked this topic for my project is that I genuinely think AI is going to keep changing the way we live, in ways we</w:t>
-      </w:r>
-      <w:r>
-        <w:rPr>
-          <w:rFonts w:ascii="Times New Roman" w:hAnsi="Times New Roman" w:cs="Times New Roman"/>
-        </w:rPr>
-        <w:t xml:space="preserve"> are</w:t>
-      </w:r>
-      <w:r>
-        <w:rPr>
-          <w:rFonts w:ascii="Times New Roman" w:hAnsi="Times New Roman" w:cs="Times New Roman"/>
-        </w:rPr>
-        <w:t xml:space="preserve"> only starting to notice. </w:t>
-      </w:r>
-      <w:r>
-        <w:rPr>
-          <w:rFonts w:ascii="Times New Roman" w:hAnsi="Times New Roman" w:cs="Times New Roman"/>
-        </w:rPr>
-        <w:t xml:space="preserve">Some of </w:t>
-      </w:r>
-      <w:r>
-        <w:rPr>
-          <w:rFonts w:ascii="Times New Roman" w:hAnsi="Times New Roman" w:cs="Times New Roman"/>
-        </w:rPr>
-        <w:t>changes</w:t>
-      </w:r>
-      <w:r>
-        <w:rPr>
-          <w:rFonts w:ascii="Times New Roman" w:hAnsi="Times New Roman" w:cs="Times New Roman"/>
-        </w:rPr>
-        <w:t xml:space="preserve"> can be</w:t>
-      </w:r>
-      <w:r>
-        <w:rPr>
-          <w:rFonts w:ascii="Times New Roman" w:hAnsi="Times New Roman" w:cs="Times New Roman"/>
-        </w:rPr>
-        <w:t xml:space="preserve"> seen already</w:t>
-      </w:r>
-      <w:r>
-        <w:rPr>
-          <w:rFonts w:ascii="Times New Roman" w:hAnsi="Times New Roman" w:cs="Times New Roman"/>
-        </w:rPr>
-        <w:t xml:space="preserve"> </w:t>
-      </w:r>
-      <w:r>
-        <w:rPr>
-          <w:rFonts w:ascii="Times New Roman" w:hAnsi="Times New Roman" w:cs="Times New Roman"/>
-        </w:rPr>
-        <w:t>—</w:t>
-      </w:r>
-      <w:r>
-        <w:rPr>
-          <w:rFonts w:ascii="Times New Roman" w:hAnsi="Times New Roman" w:cs="Times New Roman"/>
-        </w:rPr>
-        <w:t xml:space="preserve"> certain</w:t>
-      </w:r>
-      <w:r>
-        <w:rPr>
-          <w:rFonts w:ascii="Times New Roman" w:hAnsi="Times New Roman" w:cs="Times New Roman"/>
-        </w:rPr>
-        <w:t xml:space="preserve"> </w:t>
-      </w:r>
-      <w:r>
-        <w:rPr>
-          <w:rFonts w:ascii="Times New Roman" w:hAnsi="Times New Roman" w:cs="Times New Roman"/>
-        </w:rPr>
-        <w:t>jobs</w:t>
-      </w:r>
-      <w:r>
-        <w:rPr>
-          <w:rFonts w:ascii="Times New Roman" w:hAnsi="Times New Roman" w:cs="Times New Roman"/>
-        </w:rPr>
-        <w:t xml:space="preserve"> in the market</w:t>
-      </w:r>
-      <w:r>
-        <w:rPr>
-          <w:rFonts w:ascii="Times New Roman" w:hAnsi="Times New Roman" w:cs="Times New Roman"/>
-        </w:rPr>
-        <w:t xml:space="preserve"> </w:t>
-      </w:r>
-      <w:r>
-        <w:rPr>
-          <w:rFonts w:ascii="Times New Roman" w:hAnsi="Times New Roman" w:cs="Times New Roman"/>
-        </w:rPr>
-        <w:t>start to</w:t>
-      </w:r>
-      <w:r>
-        <w:rPr>
-          <w:rFonts w:ascii="Times New Roman" w:hAnsi="Times New Roman" w:cs="Times New Roman"/>
-        </w:rPr>
-        <w:t xml:space="preserve"> be</w:t>
-      </w:r>
-      <w:r>
-        <w:rPr>
-          <w:rFonts w:ascii="Times New Roman" w:hAnsi="Times New Roman" w:cs="Times New Roman"/>
-        </w:rPr>
-        <w:t xml:space="preserve"> </w:t>
-      </w:r>
-      <w:r>
-        <w:rPr>
-          <w:rFonts w:ascii="Times New Roman" w:hAnsi="Times New Roman" w:cs="Times New Roman"/>
-        </w:rPr>
-        <w:t>redefined</w:t>
-      </w:r>
-      <w:r>
-        <w:rPr>
-          <w:rFonts w:ascii="Times New Roman" w:hAnsi="Times New Roman" w:cs="Times New Roman"/>
-        </w:rPr>
-        <w:t xml:space="preserve"> because </w:t>
-      </w:r>
-      <w:r>
-        <w:rPr>
-          <w:rFonts w:ascii="Times New Roman" w:hAnsi="Times New Roman" w:cs="Times New Roman"/>
-        </w:rPr>
-        <w:t xml:space="preserve">specific </w:t>
-      </w:r>
-      <w:r>
-        <w:rPr>
-          <w:rFonts w:ascii="Times New Roman" w:hAnsi="Times New Roman" w:cs="Times New Roman"/>
-        </w:rPr>
-        <w:t xml:space="preserve">tasks </w:t>
-      </w:r>
-      <w:r>
-        <w:rPr>
-          <w:rFonts w:ascii="Times New Roman" w:hAnsi="Times New Roman" w:cs="Times New Roman"/>
-        </w:rPr>
-        <w:t>can</w:t>
-      </w:r>
-      <w:r>
-        <w:rPr>
-          <w:rFonts w:ascii="Times New Roman" w:hAnsi="Times New Roman" w:cs="Times New Roman"/>
-        </w:rPr>
-        <w:t xml:space="preserve"> now </w:t>
-      </w:r>
-      <w:r>
-        <w:rPr>
-          <w:rFonts w:ascii="Times New Roman" w:hAnsi="Times New Roman" w:cs="Times New Roman"/>
-        </w:rPr>
-        <w:t xml:space="preserve">be </w:t>
-      </w:r>
-      <w:r>
-        <w:rPr>
-          <w:rFonts w:ascii="Times New Roman" w:hAnsi="Times New Roman" w:cs="Times New Roman"/>
-        </w:rPr>
-        <w:t xml:space="preserve">automated. Even the music </w:t>
-      </w:r>
-      <w:r>
-        <w:rPr>
-          <w:rFonts w:ascii="Times New Roman" w:hAnsi="Times New Roman" w:cs="Times New Roman"/>
-        </w:rPr>
-        <w:t>we</w:t>
-      </w:r>
-      <w:r>
-        <w:rPr>
-          <w:rFonts w:ascii="Times New Roman" w:hAnsi="Times New Roman" w:cs="Times New Roman"/>
-        </w:rPr>
-        <w:t xml:space="preserve"> listen to and the games </w:t>
-      </w:r>
-      <w:r>
-        <w:rPr>
-          <w:rFonts w:ascii="Times New Roman" w:hAnsi="Times New Roman" w:cs="Times New Roman"/>
-        </w:rPr>
-        <w:t>we all</w:t>
-      </w:r>
-      <w:r>
-        <w:rPr>
-          <w:rFonts w:ascii="Times New Roman" w:hAnsi="Times New Roman" w:cs="Times New Roman"/>
-        </w:rPr>
-        <w:t xml:space="preserve"> play are shaped by algorithms that somehow know what </w:t>
-      </w:r>
-      <w:r>
-        <w:rPr>
-          <w:rFonts w:ascii="Times New Roman" w:hAnsi="Times New Roman" w:cs="Times New Roman"/>
-        </w:rPr>
-        <w:t>we</w:t>
-      </w:r>
-      <w:r>
-        <w:rPr>
-          <w:rFonts w:ascii="Times New Roman" w:hAnsi="Times New Roman" w:cs="Times New Roman"/>
-        </w:rPr>
-        <w:t xml:space="preserve"> like before </w:t>
-      </w:r>
-      <w:r>
-        <w:rPr>
-          <w:rFonts w:ascii="Times New Roman" w:hAnsi="Times New Roman" w:cs="Times New Roman"/>
-        </w:rPr>
-        <w:t>we even</w:t>
-      </w:r>
-      <w:r>
-        <w:rPr>
-          <w:rFonts w:ascii="Times New Roman" w:hAnsi="Times New Roman" w:cs="Times New Roman"/>
-        </w:rPr>
-        <w:t xml:space="preserve"> do. What really fascinates me, though, is</w:t>
-      </w:r>
-      <w:r>
-        <w:rPr>
-          <w:rFonts w:ascii="Times New Roman" w:hAnsi="Times New Roman" w:cs="Times New Roman"/>
-        </w:rPr>
-        <w:t xml:space="preserve"> not</w:t>
-      </w:r>
-      <w:r>
-        <w:rPr>
-          <w:rFonts w:ascii="Times New Roman" w:hAnsi="Times New Roman" w:cs="Times New Roman"/>
-        </w:rPr>
-        <w:t xml:space="preserve"> just the tech </w:t>
-      </w:r>
-      <w:r>
-        <w:rPr>
-          <w:rFonts w:ascii="Times New Roman" w:hAnsi="Times New Roman" w:cs="Times New Roman"/>
-        </w:rPr>
-        <w:t xml:space="preserve">itself, </w:t>
-      </w:r>
-      <w:r>
-        <w:rPr>
-          <w:rFonts w:ascii="Times New Roman" w:hAnsi="Times New Roman" w:cs="Times New Roman"/>
-        </w:rPr>
-        <w:t xml:space="preserve">it’s how people respond to it. Some </w:t>
-      </w:r>
-      <w:r>
-        <w:rPr>
-          <w:rFonts w:ascii="Times New Roman" w:hAnsi="Times New Roman" w:cs="Times New Roman"/>
-        </w:rPr>
-        <w:t>people</w:t>
-      </w:r>
-      <w:r>
-        <w:rPr>
-          <w:rFonts w:ascii="Times New Roman" w:hAnsi="Times New Roman" w:cs="Times New Roman"/>
-        </w:rPr>
-        <w:t xml:space="preserve"> are all in</w:t>
-      </w:r>
-      <w:r>
-        <w:rPr>
-          <w:rFonts w:ascii="Times New Roman" w:hAnsi="Times New Roman" w:cs="Times New Roman"/>
-        </w:rPr>
-        <w:t xml:space="preserve"> for it</w:t>
-      </w:r>
-      <w:r>
-        <w:rPr>
-          <w:rFonts w:ascii="Times New Roman" w:hAnsi="Times New Roman" w:cs="Times New Roman"/>
-        </w:rPr>
-        <w:t xml:space="preserve">, while others are more hesitant or even </w:t>
-      </w:r>
-      <w:r>
-        <w:rPr>
-          <w:rFonts w:ascii="Times New Roman" w:hAnsi="Times New Roman" w:cs="Times New Roman"/>
-        </w:rPr>
-        <w:t>sceptical</w:t>
-      </w:r>
-      <w:r>
-        <w:rPr>
-          <w:rFonts w:ascii="Times New Roman" w:hAnsi="Times New Roman" w:cs="Times New Roman"/>
-        </w:rPr>
-        <w:t>.</w:t>
-      </w:r>
-    </w:p>
-    <w:p>
-      <w:pPr>
-        <w:spacing w:line="360" w:lineRule="auto"/>
-        <w:jc w:val="both"/>
-        <w:rPr>
-          <w:rFonts w:ascii="Times New Roman" w:hAnsi="Times New Roman" w:cs="Times New Roman"/>
-        </w:rPr>
-      </w:pPr>
-      <w:r>
-        <w:rPr>
-          <w:rFonts w:ascii="Times New Roman" w:hAnsi="Times New Roman" w:cs="Times New Roman"/>
-        </w:rPr>
-        <w:t>With this project, I want to explore how AI is affecting everyday life</w:t>
-      </w:r>
-      <w:r>
-        <w:rPr>
-          <w:rFonts w:ascii="Times New Roman" w:hAnsi="Times New Roman" w:cs="Times New Roman"/>
-        </w:rPr>
-        <w:t xml:space="preserve"> </w:t>
-      </w:r>
-      <w:r>
-        <w:rPr>
-          <w:rFonts w:ascii="Times New Roman" w:hAnsi="Times New Roman" w:cs="Times New Roman"/>
-        </w:rPr>
-        <w:t>—</w:t>
-      </w:r>
-      <w:r>
-        <w:rPr>
-          <w:rFonts w:ascii="Times New Roman" w:hAnsi="Times New Roman" w:cs="Times New Roman"/>
-        </w:rPr>
-        <w:t xml:space="preserve"> </w:t>
-      </w:r>
-      <w:r>
-        <w:rPr>
-          <w:rFonts w:ascii="Times New Roman" w:hAnsi="Times New Roman" w:cs="Times New Roman"/>
-        </w:rPr>
-        <w:t xml:space="preserve">not just the big headlines, but the small stuff too. </w:t>
-      </w:r>
-      <w:r>
-        <w:rPr>
-          <w:rFonts w:ascii="Times New Roman" w:hAnsi="Times New Roman" w:cs="Times New Roman"/>
-        </w:rPr>
-        <w:t xml:space="preserve">From the content we see in our feeds to the way we approach work and relationships, </w:t>
-      </w:r>
-      <w:r>
-        <w:rPr>
-          <w:rFonts w:ascii="Times New Roman" w:hAnsi="Times New Roman" w:cs="Times New Roman"/>
-        </w:rPr>
-        <w:t xml:space="preserve">AI is already part of the picture. I’m hoping to capture both the excitement and the weirdness that comes with it. Because, like every major shift in technology, how we deal with AI now is going to shape our future in ways we probably can’t fully </w:t>
-      </w:r>
-      <w:r>
-        <w:rPr>
-          <w:rFonts w:ascii="Times New Roman" w:hAnsi="Times New Roman" w:cs="Times New Roman"/>
-        </w:rPr>
-        <w:t>comprehend</w:t>
-      </w:r>
-      <w:r>
-        <w:rPr>
-          <w:rFonts w:ascii="Times New Roman" w:hAnsi="Times New Roman" w:cs="Times New Roman"/>
-        </w:rPr>
-        <w:t xml:space="preserve"> yet.</w:t>
-      </w:r>
-    </w:p>
-    <w:p>
-      <w:pPr>
-        <w:rPr>
-          <w:rFonts w:ascii="Times New Roman" w:hAnsi="Times New Roman" w:cs="Times New Roman"/>
-        </w:rPr>
-      </w:pPr>
-      <w:r>
-        <w:rPr>
-          <w:rFonts w:ascii="Times New Roman" w:hAnsi="Times New Roman" w:cs="Times New Roman"/>
-        </w:rPr>
-        <w:br w:type="page"/>
-      </w:r>
-    </w:p>
-    <w:p>
-      <w:pPr>
-        <w:jc w:val="center"/>
+        <w:ind w:firstLine="708"/>
+        <w:rPr>
+          <w:rFonts w:ascii="Times New Roman" w:hAnsi="Times New Roman" w:cs="Times New Roman"/>
+          <w:b/>
+          <w:bCs/>
+          <w:sz w:val="28"/>
+          <w:szCs w:val="28"/>
+        </w:rPr>
+      </w:pPr>
+      <w:r>
         <w:rPr>
           <w:rFonts w:ascii="Times New Roman" w:hAnsi="Times New Roman" w:cs="Times New Roman"/>
           <w:b/>
@@ -693,8 +702,12 @@
           <w:sz w:val="32"/>
           <w:szCs w:val="32"/>
         </w:rPr>
-      </w:pPr>
-      <w:r>
+        <w:br w:type="page"/>
+      </w:r>
+    </w:p>
+    <w:p>
+      <w:pPr>
+        <w:jc w:val="center"/>
         <w:rPr>
           <w:rFonts w:ascii="Times New Roman" w:hAnsi="Times New Roman" w:cs="Times New Roman"/>
           <w:b/>
@@ -702,6 +715,697 @@
           <w:sz w:val="32"/>
           <w:szCs w:val="32"/>
         </w:rPr>
+      </w:pPr>
+      <w:r>
+        <w:rPr>
+          <w:rFonts w:ascii="Times New Roman" w:hAnsi="Times New Roman" w:cs="Times New Roman"/>
+          <w:b/>
+          <w:bCs/>
+          <w:sz w:val="32"/>
+          <w:szCs w:val="32"/>
+        </w:rPr>
+        <w:lastRenderedPageBreak/>
+        <w:t>Argument</w:t>
+      </w:r>
+    </w:p>
+    <w:p>
+      <w:pPr>
+        <w:jc w:val="center"/>
+        <w:rPr>
+          <w:rFonts w:ascii="Times New Roman" w:hAnsi="Times New Roman" w:cs="Times New Roman"/>
+          <w:b/>
+          <w:bCs/>
+          <w:sz w:val="32"/>
+          <w:szCs w:val="32"/>
+        </w:rPr>
+      </w:pPr>
+    </w:p>
+    <w:p>
+      <w:pPr>
+        <w:jc w:val="center"/>
+        <w:rPr>
+          <w:rFonts w:ascii="Times New Roman" w:hAnsi="Times New Roman" w:cs="Times New Roman"/>
+          <w:sz w:val="28"/>
+          <w:szCs w:val="28"/>
+        </w:rPr>
+      </w:pPr>
+    </w:p>
+    <w:p>
+      <w:pPr>
+        <w:spacing w:line="360" w:lineRule="auto"/>
+        <w:jc w:val="both"/>
+        <w:rPr>
+          <w:rFonts w:ascii="Times New Roman" w:hAnsi="Times New Roman" w:cs="Times New Roman"/>
+        </w:rPr>
+      </w:pPr>
+      <w:r>
+        <w:rPr>
+          <w:rFonts w:ascii="Times New Roman" w:hAnsi="Times New Roman" w:cs="Times New Roman"/>
+        </w:rPr>
+        <w:t>Ever since I was a teenager, I’ve caught myself daydreaming about the future</w:t>
+      </w:r>
+      <w:r>
+        <w:rPr>
+          <w:rFonts w:ascii="Times New Roman" w:hAnsi="Times New Roman" w:cs="Times New Roman"/>
+        </w:rPr>
+        <w:t xml:space="preserve"> </w:t>
+      </w:r>
+      <w:r>
+        <w:rPr>
+          <w:rFonts w:ascii="Times New Roman" w:hAnsi="Times New Roman" w:cs="Times New Roman"/>
+        </w:rPr>
+        <w:t>—</w:t>
+      </w:r>
+      <w:r>
+        <w:rPr>
+          <w:rFonts w:ascii="Times New Roman" w:hAnsi="Times New Roman" w:cs="Times New Roman"/>
+        </w:rPr>
+        <w:t xml:space="preserve"> </w:t>
+      </w:r>
+      <w:r>
+        <w:rPr>
+          <w:rFonts w:ascii="Times New Roman" w:hAnsi="Times New Roman" w:cs="Times New Roman"/>
+        </w:rPr>
+        <w:t xml:space="preserve">wondering what life might look like, what crazy inventions might </w:t>
+      </w:r>
+      <w:r>
+        <w:rPr>
+          <w:rFonts w:ascii="Times New Roman" w:hAnsi="Times New Roman" w:cs="Times New Roman"/>
+        </w:rPr>
+        <w:t>catch</w:t>
+      </w:r>
+      <w:r>
+        <w:rPr>
+          <w:rFonts w:ascii="Times New Roman" w:hAnsi="Times New Roman" w:cs="Times New Roman"/>
+        </w:rPr>
+        <w:t xml:space="preserve"> on, and which ones we</w:t>
+      </w:r>
+      <w:r>
+        <w:rPr>
+          <w:rFonts w:ascii="Times New Roman" w:hAnsi="Times New Roman" w:cs="Times New Roman"/>
+        </w:rPr>
+        <w:t xml:space="preserve"> wi</w:t>
+      </w:r>
+      <w:r>
+        <w:rPr>
+          <w:rFonts w:ascii="Times New Roman" w:hAnsi="Times New Roman" w:cs="Times New Roman"/>
+        </w:rPr>
+        <w:t>ll laugh about later. Out of everything, artificial intelligence has probably been the one thing I ke</w:t>
+      </w:r>
+      <w:r>
+        <w:rPr>
+          <w:rFonts w:ascii="Times New Roman" w:hAnsi="Times New Roman" w:cs="Times New Roman"/>
+        </w:rPr>
+        <w:t>pt</w:t>
+      </w:r>
+      <w:r>
+        <w:rPr>
+          <w:rFonts w:ascii="Times New Roman" w:hAnsi="Times New Roman" w:cs="Times New Roman"/>
+        </w:rPr>
+        <w:t xml:space="preserve"> coming back to. It</w:t>
+      </w:r>
+      <w:r>
+        <w:rPr>
+          <w:rFonts w:ascii="Times New Roman" w:hAnsi="Times New Roman" w:cs="Times New Roman"/>
+        </w:rPr>
+        <w:t xml:space="preserve"> i</w:t>
+      </w:r>
+      <w:r>
+        <w:rPr>
+          <w:rFonts w:ascii="Times New Roman" w:hAnsi="Times New Roman" w:cs="Times New Roman"/>
+        </w:rPr>
+        <w:t xml:space="preserve">s not just something out of sci-fi </w:t>
+      </w:r>
+      <w:r>
+        <w:rPr>
+          <w:rFonts w:ascii="Times New Roman" w:hAnsi="Times New Roman" w:cs="Times New Roman"/>
+        </w:rPr>
+        <w:t xml:space="preserve">anymore, </w:t>
+      </w:r>
+      <w:r>
+        <w:rPr>
+          <w:rFonts w:ascii="Times New Roman" w:hAnsi="Times New Roman" w:cs="Times New Roman"/>
+        </w:rPr>
+        <w:t>it</w:t>
+      </w:r>
+      <w:r>
+        <w:rPr>
+          <w:rFonts w:ascii="Times New Roman" w:hAnsi="Times New Roman" w:cs="Times New Roman"/>
+        </w:rPr>
+        <w:t xml:space="preserve"> i</w:t>
+      </w:r>
+      <w:r>
+        <w:rPr>
+          <w:rFonts w:ascii="Times New Roman" w:hAnsi="Times New Roman" w:cs="Times New Roman"/>
+        </w:rPr>
+        <w:t>s in our phones, our homes, and even quietly influencing decisions we do</w:t>
+      </w:r>
+      <w:r>
+        <w:rPr>
+          <w:rFonts w:ascii="Times New Roman" w:hAnsi="Times New Roman" w:cs="Times New Roman"/>
+        </w:rPr>
+        <w:t xml:space="preserve"> </w:t>
+      </w:r>
+      <w:r>
+        <w:rPr>
+          <w:rFonts w:ascii="Times New Roman" w:hAnsi="Times New Roman" w:cs="Times New Roman"/>
+        </w:rPr>
+        <w:t>n</w:t>
+      </w:r>
+      <w:r>
+        <w:rPr>
+          <w:rFonts w:ascii="Times New Roman" w:hAnsi="Times New Roman" w:cs="Times New Roman"/>
+        </w:rPr>
+        <w:t>o</w:t>
+      </w:r>
+      <w:r>
+        <w:rPr>
+          <w:rFonts w:ascii="Times New Roman" w:hAnsi="Times New Roman" w:cs="Times New Roman"/>
+        </w:rPr>
+        <w:t>t</w:t>
+      </w:r>
+      <w:r>
+        <w:rPr>
+          <w:rFonts w:ascii="Times New Roman" w:hAnsi="Times New Roman" w:cs="Times New Roman"/>
+        </w:rPr>
+        <w:t xml:space="preserve"> even</w:t>
+      </w:r>
+      <w:r>
+        <w:rPr>
+          <w:rFonts w:ascii="Times New Roman" w:hAnsi="Times New Roman" w:cs="Times New Roman"/>
+        </w:rPr>
+        <w:t xml:space="preserve"> realize we</w:t>
+      </w:r>
+      <w:r>
+        <w:rPr>
+          <w:rFonts w:ascii="Times New Roman" w:hAnsi="Times New Roman" w:cs="Times New Roman"/>
+        </w:rPr>
+        <w:t xml:space="preserve"> a</w:t>
+      </w:r>
+      <w:r>
+        <w:rPr>
+          <w:rFonts w:ascii="Times New Roman" w:hAnsi="Times New Roman" w:cs="Times New Roman"/>
+        </w:rPr>
+        <w:t>re making.</w:t>
+      </w:r>
+    </w:p>
+    <w:p>
+      <w:pPr>
+        <w:spacing w:line="360" w:lineRule="auto"/>
+        <w:jc w:val="both"/>
+        <w:rPr>
+          <w:rFonts w:ascii="Times New Roman" w:hAnsi="Times New Roman" w:cs="Times New Roman"/>
+        </w:rPr>
+      </w:pPr>
+      <w:r>
+        <w:rPr>
+          <w:rFonts w:ascii="Times New Roman" w:hAnsi="Times New Roman" w:cs="Times New Roman"/>
+        </w:rPr>
+        <w:t>I believe my interest in AI began after I read an article about self-driving cars. The idea that a machine could make split-second decisions on the road without a human behind the wheel honestly blew my mind</w:t>
+      </w:r>
+      <w:r>
+        <w:rPr>
+          <w:rFonts w:ascii="Times New Roman" w:hAnsi="Times New Roman" w:cs="Times New Roman"/>
+        </w:rPr>
+        <w:t xml:space="preserve"> because of how shocking this whole concept is</w:t>
+      </w:r>
+      <w:r>
+        <w:rPr>
+          <w:rFonts w:ascii="Times New Roman" w:hAnsi="Times New Roman" w:cs="Times New Roman"/>
+        </w:rPr>
+        <w:t xml:space="preserve">. After that, I started </w:t>
+      </w:r>
+      <w:r>
+        <w:rPr>
+          <w:rFonts w:ascii="Times New Roman" w:hAnsi="Times New Roman" w:cs="Times New Roman"/>
+        </w:rPr>
+        <w:t>noticing</w:t>
+      </w:r>
+      <w:r>
+        <w:rPr>
+          <w:rFonts w:ascii="Times New Roman" w:hAnsi="Times New Roman" w:cs="Times New Roman"/>
+        </w:rPr>
+        <w:t xml:space="preserve"> AI everywhere</w:t>
+      </w:r>
+      <w:r>
+        <w:rPr>
+          <w:rFonts w:ascii="Times New Roman" w:hAnsi="Times New Roman" w:cs="Times New Roman"/>
+        </w:rPr>
+        <w:t xml:space="preserve"> </w:t>
+      </w:r>
+      <w:r>
+        <w:rPr>
+          <w:rFonts w:ascii="Times New Roman" w:hAnsi="Times New Roman" w:cs="Times New Roman"/>
+        </w:rPr>
+        <w:t>—</w:t>
+      </w:r>
+      <w:r>
+        <w:rPr>
+          <w:rFonts w:ascii="Times New Roman" w:hAnsi="Times New Roman" w:cs="Times New Roman"/>
+        </w:rPr>
+        <w:t xml:space="preserve"> </w:t>
+      </w:r>
+      <w:r>
+        <w:rPr>
+          <w:rFonts w:ascii="Times New Roman" w:hAnsi="Times New Roman" w:cs="Times New Roman"/>
+        </w:rPr>
+        <w:t>in phone recommendations, in ads that weirdly seemed to know</w:t>
+      </w:r>
+      <w:r>
+        <w:rPr>
+          <w:rFonts w:ascii="Times New Roman" w:hAnsi="Times New Roman" w:cs="Times New Roman"/>
+        </w:rPr>
+        <w:t xml:space="preserve"> exactly</w:t>
+      </w:r>
+      <w:r>
+        <w:rPr>
+          <w:rFonts w:ascii="Times New Roman" w:hAnsi="Times New Roman" w:cs="Times New Roman"/>
+        </w:rPr>
+        <w:t xml:space="preserve"> what </w:t>
+      </w:r>
+      <w:r>
+        <w:rPr>
+          <w:rFonts w:ascii="Times New Roman" w:hAnsi="Times New Roman" w:cs="Times New Roman"/>
+        </w:rPr>
+        <w:t>we</w:t>
+      </w:r>
+      <w:r>
+        <w:rPr>
+          <w:rFonts w:ascii="Times New Roman" w:hAnsi="Times New Roman" w:cs="Times New Roman"/>
+        </w:rPr>
+        <w:t xml:space="preserve"> </w:t>
+      </w:r>
+      <w:r>
+        <w:rPr>
+          <w:rFonts w:ascii="Times New Roman" w:hAnsi="Times New Roman" w:cs="Times New Roman"/>
+        </w:rPr>
+        <w:t>are</w:t>
+      </w:r>
+      <w:r>
+        <w:rPr>
+          <w:rFonts w:ascii="Times New Roman" w:hAnsi="Times New Roman" w:cs="Times New Roman"/>
+        </w:rPr>
+        <w:t xml:space="preserve"> thinking about. That</w:t>
+      </w:r>
+      <w:r>
+        <w:rPr>
+          <w:rFonts w:ascii="Times New Roman" w:hAnsi="Times New Roman" w:cs="Times New Roman"/>
+        </w:rPr>
+        <w:t xml:space="preserve"> i</w:t>
+      </w:r>
+      <w:r>
+        <w:rPr>
+          <w:rFonts w:ascii="Times New Roman" w:hAnsi="Times New Roman" w:cs="Times New Roman"/>
+        </w:rPr>
+        <w:t>s when it hit me: AI is</w:t>
+      </w:r>
+      <w:r>
+        <w:rPr>
+          <w:rFonts w:ascii="Times New Roman" w:hAnsi="Times New Roman" w:cs="Times New Roman"/>
+        </w:rPr>
+        <w:t xml:space="preserve"> </w:t>
+      </w:r>
+      <w:r>
+        <w:rPr>
+          <w:rFonts w:ascii="Times New Roman" w:hAnsi="Times New Roman" w:cs="Times New Roman"/>
+        </w:rPr>
+        <w:t>n</w:t>
+      </w:r>
+      <w:r>
+        <w:rPr>
+          <w:rFonts w:ascii="Times New Roman" w:hAnsi="Times New Roman" w:cs="Times New Roman"/>
+        </w:rPr>
+        <w:t>o</w:t>
+      </w:r>
+      <w:r>
+        <w:rPr>
+          <w:rFonts w:ascii="Times New Roman" w:hAnsi="Times New Roman" w:cs="Times New Roman"/>
+        </w:rPr>
+        <w:t>t just about robots or futuristic tech. It’s already woven into our daily lives.</w:t>
+      </w:r>
+    </w:p>
+    <w:p>
+      <w:pPr>
+        <w:spacing w:line="360" w:lineRule="auto"/>
+        <w:jc w:val="both"/>
+        <w:rPr>
+          <w:rFonts w:ascii="Times New Roman" w:hAnsi="Times New Roman" w:cs="Times New Roman"/>
+        </w:rPr>
+      </w:pPr>
+      <w:r>
+        <w:rPr>
+          <w:rFonts w:ascii="Times New Roman" w:hAnsi="Times New Roman" w:cs="Times New Roman"/>
+        </w:rPr>
+        <w:t>One of the reasons I picked this topic for my project is that I genuinely think AI is going to keep changing the way we live, in ways we</w:t>
+      </w:r>
+      <w:r>
+        <w:rPr>
+          <w:rFonts w:ascii="Times New Roman" w:hAnsi="Times New Roman" w:cs="Times New Roman"/>
+        </w:rPr>
+        <w:t xml:space="preserve"> are</w:t>
+      </w:r>
+      <w:r>
+        <w:rPr>
+          <w:rFonts w:ascii="Times New Roman" w:hAnsi="Times New Roman" w:cs="Times New Roman"/>
+        </w:rPr>
+        <w:t xml:space="preserve"> only starting to notice. </w:t>
+      </w:r>
+      <w:r>
+        <w:rPr>
+          <w:rFonts w:ascii="Times New Roman" w:hAnsi="Times New Roman" w:cs="Times New Roman"/>
+        </w:rPr>
+        <w:t xml:space="preserve">Some of </w:t>
+      </w:r>
+      <w:r>
+        <w:rPr>
+          <w:rFonts w:ascii="Times New Roman" w:hAnsi="Times New Roman" w:cs="Times New Roman"/>
+        </w:rPr>
+        <w:t>changes</w:t>
+      </w:r>
+      <w:r>
+        <w:rPr>
+          <w:rFonts w:ascii="Times New Roman" w:hAnsi="Times New Roman" w:cs="Times New Roman"/>
+        </w:rPr>
+        <w:t xml:space="preserve"> can be</w:t>
+      </w:r>
+      <w:r>
+        <w:rPr>
+          <w:rFonts w:ascii="Times New Roman" w:hAnsi="Times New Roman" w:cs="Times New Roman"/>
+        </w:rPr>
+        <w:t xml:space="preserve"> seen already</w:t>
+      </w:r>
+      <w:r>
+        <w:rPr>
+          <w:rFonts w:ascii="Times New Roman" w:hAnsi="Times New Roman" w:cs="Times New Roman"/>
+        </w:rPr>
+        <w:t xml:space="preserve"> </w:t>
+      </w:r>
+      <w:r>
+        <w:rPr>
+          <w:rFonts w:ascii="Times New Roman" w:hAnsi="Times New Roman" w:cs="Times New Roman"/>
+        </w:rPr>
+        <w:t>—</w:t>
+      </w:r>
+      <w:r>
+        <w:rPr>
+          <w:rFonts w:ascii="Times New Roman" w:hAnsi="Times New Roman" w:cs="Times New Roman"/>
+        </w:rPr>
+        <w:t xml:space="preserve"> certain</w:t>
+      </w:r>
+      <w:r>
+        <w:rPr>
+          <w:rFonts w:ascii="Times New Roman" w:hAnsi="Times New Roman" w:cs="Times New Roman"/>
+        </w:rPr>
+        <w:t xml:space="preserve"> </w:t>
+      </w:r>
+      <w:r>
+        <w:rPr>
+          <w:rFonts w:ascii="Times New Roman" w:hAnsi="Times New Roman" w:cs="Times New Roman"/>
+        </w:rPr>
+        <w:t>jobs</w:t>
+      </w:r>
+      <w:r>
+        <w:rPr>
+          <w:rFonts w:ascii="Times New Roman" w:hAnsi="Times New Roman" w:cs="Times New Roman"/>
+        </w:rPr>
+        <w:t xml:space="preserve"> in the market</w:t>
+      </w:r>
+      <w:r>
+        <w:rPr>
+          <w:rFonts w:ascii="Times New Roman" w:hAnsi="Times New Roman" w:cs="Times New Roman"/>
+        </w:rPr>
+        <w:t xml:space="preserve"> </w:t>
+      </w:r>
+      <w:r>
+        <w:rPr>
+          <w:rFonts w:ascii="Times New Roman" w:hAnsi="Times New Roman" w:cs="Times New Roman"/>
+        </w:rPr>
+        <w:t>start to</w:t>
+      </w:r>
+      <w:r>
+        <w:rPr>
+          <w:rFonts w:ascii="Times New Roman" w:hAnsi="Times New Roman" w:cs="Times New Roman"/>
+        </w:rPr>
+        <w:t xml:space="preserve"> be</w:t>
+      </w:r>
+      <w:r>
+        <w:rPr>
+          <w:rFonts w:ascii="Times New Roman" w:hAnsi="Times New Roman" w:cs="Times New Roman"/>
+        </w:rPr>
+        <w:t xml:space="preserve"> </w:t>
+      </w:r>
+      <w:r>
+        <w:rPr>
+          <w:rFonts w:ascii="Times New Roman" w:hAnsi="Times New Roman" w:cs="Times New Roman"/>
+        </w:rPr>
+        <w:t>redefined</w:t>
+      </w:r>
+      <w:r>
+        <w:rPr>
+          <w:rFonts w:ascii="Times New Roman" w:hAnsi="Times New Roman" w:cs="Times New Roman"/>
+        </w:rPr>
+        <w:t xml:space="preserve"> because </w:t>
+      </w:r>
+      <w:r>
+        <w:rPr>
+          <w:rFonts w:ascii="Times New Roman" w:hAnsi="Times New Roman" w:cs="Times New Roman"/>
+        </w:rPr>
+        <w:t xml:space="preserve">specific </w:t>
+      </w:r>
+      <w:r>
+        <w:rPr>
+          <w:rFonts w:ascii="Times New Roman" w:hAnsi="Times New Roman" w:cs="Times New Roman"/>
+        </w:rPr>
+        <w:t xml:space="preserve">tasks </w:t>
+      </w:r>
+      <w:r>
+        <w:rPr>
+          <w:rFonts w:ascii="Times New Roman" w:hAnsi="Times New Roman" w:cs="Times New Roman"/>
+        </w:rPr>
+        <w:t>can</w:t>
+      </w:r>
+      <w:r>
+        <w:rPr>
+          <w:rFonts w:ascii="Times New Roman" w:hAnsi="Times New Roman" w:cs="Times New Roman"/>
+        </w:rPr>
+        <w:t xml:space="preserve"> now </w:t>
+      </w:r>
+      <w:r>
+        <w:rPr>
+          <w:rFonts w:ascii="Times New Roman" w:hAnsi="Times New Roman" w:cs="Times New Roman"/>
+        </w:rPr>
+        <w:t xml:space="preserve">be </w:t>
+      </w:r>
+      <w:r>
+        <w:rPr>
+          <w:rFonts w:ascii="Times New Roman" w:hAnsi="Times New Roman" w:cs="Times New Roman"/>
+        </w:rPr>
+        <w:t xml:space="preserve">automated. Even the music </w:t>
+      </w:r>
+      <w:r>
+        <w:rPr>
+          <w:rFonts w:ascii="Times New Roman" w:hAnsi="Times New Roman" w:cs="Times New Roman"/>
+        </w:rPr>
+        <w:t>we</w:t>
+      </w:r>
+      <w:r>
+        <w:rPr>
+          <w:rFonts w:ascii="Times New Roman" w:hAnsi="Times New Roman" w:cs="Times New Roman"/>
+        </w:rPr>
+        <w:t xml:space="preserve"> listen to and the games </w:t>
+      </w:r>
+      <w:r>
+        <w:rPr>
+          <w:rFonts w:ascii="Times New Roman" w:hAnsi="Times New Roman" w:cs="Times New Roman"/>
+        </w:rPr>
+        <w:t>we all</w:t>
+      </w:r>
+      <w:r>
+        <w:rPr>
+          <w:rFonts w:ascii="Times New Roman" w:hAnsi="Times New Roman" w:cs="Times New Roman"/>
+        </w:rPr>
+        <w:t xml:space="preserve"> play are shaped by algorithms that somehow know what </w:t>
+      </w:r>
+      <w:r>
+        <w:rPr>
+          <w:rFonts w:ascii="Times New Roman" w:hAnsi="Times New Roman" w:cs="Times New Roman"/>
+        </w:rPr>
+        <w:t>we</w:t>
+      </w:r>
+      <w:r>
+        <w:rPr>
+          <w:rFonts w:ascii="Times New Roman" w:hAnsi="Times New Roman" w:cs="Times New Roman"/>
+        </w:rPr>
+        <w:t xml:space="preserve"> like before </w:t>
+      </w:r>
+      <w:r>
+        <w:rPr>
+          <w:rFonts w:ascii="Times New Roman" w:hAnsi="Times New Roman" w:cs="Times New Roman"/>
+        </w:rPr>
+        <w:t>we even</w:t>
+      </w:r>
+      <w:r>
+        <w:rPr>
+          <w:rFonts w:ascii="Times New Roman" w:hAnsi="Times New Roman" w:cs="Times New Roman"/>
+        </w:rPr>
+        <w:t xml:space="preserve"> do. What really fascinates me, though, is</w:t>
+      </w:r>
+      <w:r>
+        <w:rPr>
+          <w:rFonts w:ascii="Times New Roman" w:hAnsi="Times New Roman" w:cs="Times New Roman"/>
+        </w:rPr>
+        <w:t xml:space="preserve"> not</w:t>
+      </w:r>
+      <w:r>
+        <w:rPr>
+          <w:rFonts w:ascii="Times New Roman" w:hAnsi="Times New Roman" w:cs="Times New Roman"/>
+        </w:rPr>
+        <w:t xml:space="preserve"> just the tech </w:t>
+      </w:r>
+      <w:r>
+        <w:rPr>
+          <w:rFonts w:ascii="Times New Roman" w:hAnsi="Times New Roman" w:cs="Times New Roman"/>
+        </w:rPr>
+        <w:t xml:space="preserve">itself, </w:t>
+      </w:r>
+      <w:r>
+        <w:rPr>
+          <w:rFonts w:ascii="Times New Roman" w:hAnsi="Times New Roman" w:cs="Times New Roman"/>
+        </w:rPr>
+        <w:t xml:space="preserve">it’s how people respond to it. Some </w:t>
+      </w:r>
+      <w:r>
+        <w:rPr>
+          <w:rFonts w:ascii="Times New Roman" w:hAnsi="Times New Roman" w:cs="Times New Roman"/>
+        </w:rPr>
+        <w:t>people</w:t>
+      </w:r>
+      <w:r>
+        <w:rPr>
+          <w:rFonts w:ascii="Times New Roman" w:hAnsi="Times New Roman" w:cs="Times New Roman"/>
+        </w:rPr>
+        <w:t xml:space="preserve"> are all in</w:t>
+      </w:r>
+      <w:r>
+        <w:rPr>
+          <w:rFonts w:ascii="Times New Roman" w:hAnsi="Times New Roman" w:cs="Times New Roman"/>
+        </w:rPr>
+        <w:t xml:space="preserve"> for it</w:t>
+      </w:r>
+      <w:r>
+        <w:rPr>
+          <w:rFonts w:ascii="Times New Roman" w:hAnsi="Times New Roman" w:cs="Times New Roman"/>
+        </w:rPr>
+        <w:t xml:space="preserve">, while others are more hesitant or even </w:t>
+      </w:r>
+      <w:r>
+        <w:rPr>
+          <w:rFonts w:ascii="Times New Roman" w:hAnsi="Times New Roman" w:cs="Times New Roman"/>
+        </w:rPr>
+        <w:t>sceptical</w:t>
+      </w:r>
+      <w:r>
+        <w:rPr>
+          <w:rFonts w:ascii="Times New Roman" w:hAnsi="Times New Roman" w:cs="Times New Roman"/>
+        </w:rPr>
+        <w:t>.</w:t>
+      </w:r>
+    </w:p>
+    <w:p>
+      <w:pPr>
+        <w:spacing w:line="360" w:lineRule="auto"/>
+        <w:jc w:val="both"/>
+        <w:rPr>
+          <w:rFonts w:ascii="Times New Roman" w:hAnsi="Times New Roman" w:cs="Times New Roman"/>
+        </w:rPr>
+      </w:pPr>
+      <w:r>
+        <w:rPr>
+          <w:rFonts w:ascii="Times New Roman" w:hAnsi="Times New Roman" w:cs="Times New Roman"/>
+        </w:rPr>
+        <w:t>With this project, I want to explore how AI is affecting everyday life</w:t>
+      </w:r>
+      <w:r>
+        <w:rPr>
+          <w:rFonts w:ascii="Times New Roman" w:hAnsi="Times New Roman" w:cs="Times New Roman"/>
+        </w:rPr>
+        <w:t xml:space="preserve"> </w:t>
+      </w:r>
+      <w:r>
+        <w:rPr>
+          <w:rFonts w:ascii="Times New Roman" w:hAnsi="Times New Roman" w:cs="Times New Roman"/>
+        </w:rPr>
+        <w:t>—</w:t>
+      </w:r>
+      <w:r>
+        <w:rPr>
+          <w:rFonts w:ascii="Times New Roman" w:hAnsi="Times New Roman" w:cs="Times New Roman"/>
+        </w:rPr>
+        <w:t xml:space="preserve"> </w:t>
+      </w:r>
+      <w:r>
+        <w:rPr>
+          <w:rFonts w:ascii="Times New Roman" w:hAnsi="Times New Roman" w:cs="Times New Roman"/>
+        </w:rPr>
+        <w:t xml:space="preserve">not just the big headlines, but the small stuff too. </w:t>
+      </w:r>
+      <w:r>
+        <w:rPr>
+          <w:rFonts w:ascii="Times New Roman" w:hAnsi="Times New Roman" w:cs="Times New Roman"/>
+        </w:rPr>
+        <w:t xml:space="preserve">From the content we see in our feeds to the way we approach work and relationships, </w:t>
+      </w:r>
+      <w:r>
+        <w:rPr>
+          <w:rFonts w:ascii="Times New Roman" w:hAnsi="Times New Roman" w:cs="Times New Roman"/>
+        </w:rPr>
+        <w:t xml:space="preserve">AI is already part of the picture. I’m hoping to capture both the excitement and the weirdness that comes with it. Because, like every major shift in technology, how we deal with AI now is going to shape our future in ways we probably can’t fully </w:t>
+      </w:r>
+      <w:r>
+        <w:rPr>
+          <w:rFonts w:ascii="Times New Roman" w:hAnsi="Times New Roman" w:cs="Times New Roman"/>
+        </w:rPr>
+        <w:t>comprehend</w:t>
+      </w:r>
+      <w:r>
+        <w:rPr>
+          <w:rFonts w:ascii="Times New Roman" w:hAnsi="Times New Roman" w:cs="Times New Roman"/>
+        </w:rPr>
+        <w:t xml:space="preserve"> yet.</w:t>
+      </w:r>
+    </w:p>
+    <w:p>
+      <w:pPr>
+        <w:rPr>
+          <w:rFonts w:ascii="Times New Roman" w:hAnsi="Times New Roman" w:cs="Times New Roman"/>
+        </w:rPr>
+      </w:pPr>
+      <w:r>
+        <w:rPr>
+          <w:rFonts w:ascii="Times New Roman" w:hAnsi="Times New Roman" w:cs="Times New Roman"/>
+        </w:rPr>
+        <w:br w:type="page"/>
+      </w:r>
+    </w:p>
+    <w:p>
+      <w:pPr>
+        <w:jc w:val="center"/>
+        <w:rPr>
+          <w:rFonts w:ascii="Times New Roman" w:hAnsi="Times New Roman" w:cs="Times New Roman"/>
+          <w:b/>
+          <w:bCs/>
+          <w:sz w:val="32"/>
+          <w:szCs w:val="32"/>
+        </w:rPr>
+      </w:pPr>
+      <w:r>
+        <w:rPr>
+          <w:rFonts w:ascii="Times New Roman" w:hAnsi="Times New Roman" w:cs="Times New Roman"/>
+          <w:b/>
+          <w:bCs/>
+          <w:sz w:val="32"/>
+          <w:szCs w:val="32"/>
+        </w:rPr>
         <w:lastRenderedPageBreak/>
         <w:t>Précis</w:t>
       </w:r>
@@ -759,6 +1463,7 @@
           <w:rFonts w:ascii="Times New Roman" w:hAnsi="Times New Roman" w:cs="Times New Roman"/>
         </w:rPr>
       </w:pPr>
+      <w:bookmarkStart w:id="0" w:name="_Hlk219379525"/>
       <w:r>
         <w:rPr>
           <w:rFonts w:ascii="Times New Roman" w:hAnsi="Times New Roman" w:cs="Times New Roman"/>
@@ -771,7 +1476,14 @@
         <w:rPr>
           <w:rFonts w:ascii="Times New Roman" w:hAnsi="Times New Roman" w:cs="Times New Roman"/>
         </w:rPr>
-        <w:t xml:space="preserve"> outlines the development of artificial intelligence from its early theoretical origins to its widespread use today. It explains how technological progress and increased access to data have allowed AI to move from research environments into everyday applications.</w:t>
+        <w:t xml:space="preserve"> </w:t>
+      </w:r>
+      <w:bookmarkEnd w:id="0"/>
+      <w:r>
+        <w:rPr>
+          <w:rFonts w:ascii="Times New Roman" w:hAnsi="Times New Roman" w:cs="Times New Roman"/>
+        </w:rPr>
+        <w:t>outlines the development of artificial intelligence from its early theoretical origins to its widespread use today. It explains how technological progress and increased access to data have allowed AI to move from research environments into everyday applications.</w:t>
       </w:r>
     </w:p>
     <w:p>
@@ -861,40 +1573,8 @@
           <w:szCs w:val="32"/>
         </w:rPr>
         <w:lastRenderedPageBreak/>
-        <w:t>Chapter 1</w:t>
-      </w:r>
-      <w:r>
-        <w:rPr>
-          <w:rFonts w:ascii="Times New Roman" w:hAnsi="Times New Roman" w:cs="Times New Roman"/>
-          <w:b/>
-          <w:bCs/>
-          <w:sz w:val="32"/>
-          <w:szCs w:val="32"/>
-        </w:rPr>
-        <w:t>.</w:t>
-      </w:r>
-      <w:r>
-        <w:rPr>
-          <w:rFonts w:ascii="Times New Roman" w:hAnsi="Times New Roman" w:cs="Times New Roman"/>
-          <w:b/>
-          <w:bCs/>
-          <w:sz w:val="32"/>
-          <w:szCs w:val="32"/>
-        </w:rPr>
-        <w:t xml:space="preserve"> Introduction</w:t>
-      </w:r>
-    </w:p>
-    <w:p>
-      <w:pPr>
-        <w:jc w:val="center"/>
-        <w:rPr>
-          <w:rFonts w:ascii="Times New Roman" w:hAnsi="Times New Roman" w:cs="Times New Roman"/>
-          <w:b/>
-          <w:bCs/>
-          <w:sz w:val="32"/>
-          <w:szCs w:val="32"/>
-        </w:rPr>
-      </w:pPr>
+        <w:t>Chapter 1 – Introduction</w:t>
+      </w:r>
     </w:p>
     <w:p>
       <w:pPr>
@@ -910,6 +1590,17 @@
     <w:p>
       <w:pPr>
         <w:spacing w:line="360" w:lineRule="auto"/>
+        <w:jc w:val="center"/>
+        <w:rPr>
+          <w:rFonts w:ascii="Times New Roman" w:hAnsi="Times New Roman" w:cs="Times New Roman"/>
+          <w:sz w:val="28"/>
+          <w:szCs w:val="28"/>
+        </w:rPr>
+      </w:pPr>
+    </w:p>
+    <w:p>
+      <w:pPr>
+        <w:spacing w:line="360" w:lineRule="auto"/>
         <w:jc w:val="both"/>
         <w:rPr>
           <w:rFonts w:ascii="Times New Roman" w:hAnsi="Times New Roman" w:cs="Times New Roman"/>
@@ -998,31 +1689,16 @@
       </w:pPr>
       <w:r>
         <w:rPr>
-          <w:rFonts w:ascii="Times New Roman" w:hAnsi="Times New Roman" w:cs="Times New Roman"/>
-        </w:rPr>
-        <w:t>As with all major technological revolutions, the spread of AI brings both opportunities and challenges. It promises efficiency, safety, and convenience, but it also raises important questions about privacy, employment, and the balance between human control and machine autonomy. These concerns make AI one of the most debated and influential subjects of the present time, and its role in shaping everyday life will only continue to grow in the years to come.</w:t>
-      </w:r>
-    </w:p>
-    <w:p>
-      <w:pPr>
-        <w:spacing w:line="360" w:lineRule="auto"/>
-        <w:jc w:val="both"/>
-        <w:rPr>
-          <w:rFonts w:ascii="Times New Roman" w:hAnsi="Times New Roman" w:cs="Times New Roman"/>
-        </w:rPr>
-      </w:pPr>
-      <w:r>
-        <w:rPr>
           <w:noProof/>
         </w:rPr>
         <w:drawing>
-          <wp:anchor distT="0" distB="0" distL="114300" distR="114300" simplePos="0" relativeHeight="251659264" behindDoc="1" locked="0" layoutInCell="1" allowOverlap="1" wp14:anchorId="658D376B" wp14:editId="4DEDD130">
+          <wp:anchor distT="0" distB="0" distL="114300" distR="114300" simplePos="0" relativeHeight="251659264" behindDoc="1" locked="0" layoutInCell="1" allowOverlap="1" wp14:anchorId="658D376B" wp14:editId="67EABBA6">
             <wp:simplePos x="0" y="0"/>
             <wp:positionH relativeFrom="column">
-              <wp:posOffset>3166069</wp:posOffset>
+              <wp:posOffset>2852208</wp:posOffset>
             </wp:positionH>
             <wp:positionV relativeFrom="paragraph">
-              <wp:posOffset>-2539</wp:posOffset>
+              <wp:posOffset>1253279</wp:posOffset>
             </wp:positionV>
             <wp:extent cx="2552741" cy="1615440"/>
             <wp:effectExtent l="0" t="0" r="0" b="3810"/>
@@ -1056,7 +1732,7 @@
                   <pic:spPr bwMode="auto">
                     <a:xfrm>
                       <a:off x="0" y="0"/>
-                      <a:ext cx="2560818" cy="1620551"/>
+                      <a:ext cx="2552741" cy="1615440"/>
                     </a:xfrm>
                     <a:prstGeom prst="rect">
                       <a:avLst/>
@@ -1083,13 +1759,13 @@
           <w:noProof/>
         </w:rPr>
         <w:drawing>
-          <wp:anchor distT="0" distB="0" distL="114300" distR="114300" simplePos="0" relativeHeight="251658240" behindDoc="1" locked="0" layoutInCell="1" allowOverlap="1" wp14:anchorId="73C9F2E9" wp14:editId="44D32547">
+          <wp:anchor distT="0" distB="0" distL="114300" distR="114300" simplePos="0" relativeHeight="251658240" behindDoc="1" locked="0" layoutInCell="1" allowOverlap="1" wp14:anchorId="73C9F2E9" wp14:editId="21EEF99D">
             <wp:simplePos x="0" y="0"/>
             <wp:positionH relativeFrom="margin">
-              <wp:posOffset>-635</wp:posOffset>
+              <wp:posOffset>-288502</wp:posOffset>
             </wp:positionH>
             <wp:positionV relativeFrom="paragraph">
-              <wp:posOffset>-2540</wp:posOffset>
+              <wp:posOffset>1294976</wp:posOffset>
             </wp:positionV>
             <wp:extent cx="2921362" cy="1600200"/>
             <wp:effectExtent l="0" t="0" r="0" b="0"/>
@@ -1123,7 +1799,7 @@
                   <pic:spPr bwMode="auto">
                     <a:xfrm>
                       <a:off x="0" y="0"/>
-                      <a:ext cx="2924805" cy="1602086"/>
+                      <a:ext cx="2921362" cy="1600200"/>
                     </a:xfrm>
                     <a:prstGeom prst="rect">
                       <a:avLst/>
@@ -1145,6 +1821,21 @@
           </wp:anchor>
         </w:drawing>
       </w:r>
+      <w:r>
+        <w:rPr>
+          <w:rFonts w:ascii="Times New Roman" w:hAnsi="Times New Roman" w:cs="Times New Roman"/>
+        </w:rPr>
+        <w:t>As with all major technological revolutions, the spread of AI brings both opportunities and challenges. It promises efficiency, safety, and convenience, but it also raises important questions about privacy, employment, and the balance between human control and machine autonomy. These concerns make AI one of the most debated and influential subjects of the present time, and its role in shaping everyday life will only continue to grow in the years to come.</w:t>
+      </w:r>
+    </w:p>
+    <w:p>
+      <w:pPr>
+        <w:spacing w:line="360" w:lineRule="auto"/>
+        <w:jc w:val="both"/>
+        <w:rPr>
+          <w:rFonts w:ascii="Times New Roman" w:hAnsi="Times New Roman" w:cs="Times New Roman"/>
+        </w:rPr>
+      </w:pPr>
     </w:p>
     <w:p>
       <w:pPr>
@@ -1172,22 +1863,20 @@
         <w:jc w:val="center"/>
         <w:rPr>
           <w:rFonts w:ascii="Times New Roman" w:hAnsi="Times New Roman" w:cs="Times New Roman"/>
+          <w:sz w:val="28"/>
+          <w:szCs w:val="28"/>
+        </w:rPr>
+      </w:pPr>
+      <w:r>
+        <w:rPr>
+          <w:rFonts w:ascii="Times New Roman" w:hAnsi="Times New Roman" w:cs="Times New Roman"/>
           <w:b/>
           <w:bCs/>
           <w:sz w:val="32"/>
           <w:szCs w:val="32"/>
         </w:rPr>
-      </w:pPr>
-      <w:r>
-        <w:rPr>
-          <w:rFonts w:ascii="Times New Roman" w:hAnsi="Times New Roman" w:cs="Times New Roman"/>
-          <w:b/>
-          <w:bCs/>
-          <w:sz w:val="32"/>
-          <w:szCs w:val="32"/>
-        </w:rPr>
         <w:lastRenderedPageBreak/>
-        <w:t>Chapter 2. Benefits</w:t>
+        <w:t>Chapter 2 – Benefits</w:t>
       </w:r>
     </w:p>
     <w:p>
@@ -1386,21 +2075,7 @@
         <w:rPr>
           <w:rFonts w:ascii="Times New Roman" w:hAnsi="Times New Roman" w:cs="Times New Roman"/>
         </w:rPr>
-        <w:t xml:space="preserve">AI is not limited to the professional sphere. It is also present in our private lives in ways that bring convenience, comfort, and even health benefits. Smart homes, for example, are becoming increasingly common. They use AI to regulate heating, cooling, and lighting </w:t>
-      </w:r>
-      <w:proofErr w:type="gramStart"/>
-      <w:r>
-        <w:rPr>
-          <w:rFonts w:ascii="Times New Roman" w:hAnsi="Times New Roman" w:cs="Times New Roman"/>
-        </w:rPr>
-        <w:t>in order to</w:t>
-      </w:r>
-      <w:proofErr w:type="gramEnd"/>
-      <w:r>
-        <w:rPr>
-          <w:rFonts w:ascii="Times New Roman" w:hAnsi="Times New Roman" w:cs="Times New Roman"/>
-        </w:rPr>
-        <w:t xml:space="preserve"> save energy and reduce costs.</w:t>
+        <w:t>AI is not limited to the professional sphere. It is also present in our private lives in ways that bring convenience, comfort, and even health benefits. Smart homes, for example, are becoming increasingly common. They use AI to regulate heating, cooling, and lighting in order to save energy and reduce costs.</w:t>
       </w:r>
       <w:r>
         <w:rPr>
@@ -1428,21 +2103,7 @@
           <w:rFonts w:ascii="Times New Roman" w:hAnsi="Times New Roman" w:cs="Times New Roman"/>
         </w:rPr>
         <w:lastRenderedPageBreak/>
-        <w:t xml:space="preserve">Entertainment and communication are further examples of AI’s impact on daily life. Streaming platforms recommend films and music based on personal taste, while translation apps allow people to communicate across language barriers. </w:t>
-      </w:r>
-      <w:proofErr w:type="gramStart"/>
-      <w:r>
-        <w:rPr>
-          <w:rFonts w:ascii="Times New Roman" w:hAnsi="Times New Roman" w:cs="Times New Roman"/>
-        </w:rPr>
-        <w:t>All of</w:t>
-      </w:r>
-      <w:proofErr w:type="gramEnd"/>
-      <w:r>
-        <w:rPr>
-          <w:rFonts w:ascii="Times New Roman" w:hAnsi="Times New Roman" w:cs="Times New Roman"/>
-        </w:rPr>
-        <w:t xml:space="preserve"> these technologies bring a sense of personalisation and accessibility that was unthinkable just a few decades ago.</w:t>
+        <w:t>Entertainment and communication are further examples of AI’s impact on daily life. Streaming platforms recommend films and music based on personal taste, while translation apps allow people to communicate across language barriers. All of these technologies bring a sense of personalisation and accessibility that was unthinkable just a few decades ago.</w:t>
       </w:r>
     </w:p>
     <w:p>
@@ -1567,14 +2228,12 @@
         </w:rPr>
         <w:t xml:space="preserve">t just lengthen </w:t>
       </w:r>
-      <w:proofErr w:type="gramStart"/>
       <w:r>
         <w:rPr>
           <w:rFonts w:ascii="Times New Roman" w:hAnsi="Times New Roman" w:cs="Times New Roman"/>
         </w:rPr>
         <w:t>life,</w:t>
       </w:r>
-      <w:proofErr w:type="gramEnd"/>
       <w:r>
         <w:rPr>
           <w:rFonts w:ascii="Times New Roman" w:hAnsi="Times New Roman" w:cs="Times New Roman"/>
@@ -1692,21 +2351,7 @@
         <w:rPr>
           <w:rFonts w:ascii="Times New Roman" w:hAnsi="Times New Roman" w:cs="Times New Roman"/>
         </w:rPr>
-        <w:t xml:space="preserve">Transportation is one of the areas where smart cities can offer the greatest benefits. AI-powered traffic systems </w:t>
-      </w:r>
-      <w:proofErr w:type="gramStart"/>
-      <w:r>
-        <w:rPr>
-          <w:rFonts w:ascii="Times New Roman" w:hAnsi="Times New Roman" w:cs="Times New Roman"/>
-        </w:rPr>
-        <w:t>are able to</w:t>
-      </w:r>
-      <w:proofErr w:type="gramEnd"/>
-      <w:r>
-        <w:rPr>
-          <w:rFonts w:ascii="Times New Roman" w:hAnsi="Times New Roman" w:cs="Times New Roman"/>
-        </w:rPr>
-        <w:t xml:space="preserve"> analyse data</w:t>
+        <w:t>Transportation is one of the areas where smart cities can offer the greatest benefits. AI-powered traffic systems are able to analyse data</w:t>
       </w:r>
       <w:r>
         <w:rPr>
@@ -1803,21 +2448,7 @@
         <w:rPr>
           <w:rFonts w:ascii="Times New Roman" w:hAnsi="Times New Roman" w:cs="Times New Roman"/>
         </w:rPr>
-        <w:t xml:space="preserve">adapt their </w:t>
-      </w:r>
-      <w:proofErr w:type="gramStart"/>
-      <w:r>
-        <w:rPr>
-          <w:rFonts w:ascii="Times New Roman" w:hAnsi="Times New Roman" w:cs="Times New Roman"/>
-        </w:rPr>
-        <w:t>speed</w:t>
-      </w:r>
-      <w:proofErr w:type="gramEnd"/>
-      <w:r>
-        <w:rPr>
-          <w:rFonts w:ascii="Times New Roman" w:hAnsi="Times New Roman" w:cs="Times New Roman"/>
-        </w:rPr>
-        <w:t xml:space="preserve"> accordingly</w:t>
+        <w:t>adapt their speed accordingly</w:t>
       </w:r>
       <w:r>
         <w:rPr>
@@ -2300,7 +2931,7 @@
           <w:szCs w:val="32"/>
         </w:rPr>
         <w:lastRenderedPageBreak/>
-        <w:t>Chapter 3. Drawbacks</w:t>
+        <w:t>Chapter 3 – Drawbacks</w:t>
       </w:r>
     </w:p>
     <w:p>
@@ -2733,21 +3364,7 @@
         <w:rPr>
           <w:rFonts w:ascii="Times New Roman" w:hAnsi="Times New Roman" w:cs="Times New Roman"/>
         </w:rPr>
-        <w:t xml:space="preserve">Socially, the spread of AI can also change the way people interact with each other. AI-powered chatbots and virtual assistants may make life easier, but they also risk reducing human contact. Some experts warn that as technology becomes more personal and </w:t>
-      </w:r>
-      <w:proofErr w:type="gramStart"/>
-      <w:r>
-        <w:rPr>
-          <w:rFonts w:ascii="Times New Roman" w:hAnsi="Times New Roman" w:cs="Times New Roman"/>
-        </w:rPr>
-        <w:t>responsive,</w:t>
-      </w:r>
-      <w:proofErr w:type="gramEnd"/>
-      <w:r>
-        <w:rPr>
-          <w:rFonts w:ascii="Times New Roman" w:hAnsi="Times New Roman" w:cs="Times New Roman"/>
-        </w:rPr>
-        <w:t xml:space="preserve"> it might replace genuine human relationships with artificial connections.</w:t>
+        <w:t>Socially, the spread of AI can also change the way people interact with each other. AI-powered chatbots and virtual assistants may make life easier, but they also risk reducing human contact. Some experts warn that as technology becomes more personal and responsive, it might replace genuine human relationships with artificial connections.</w:t>
       </w:r>
     </w:p>
     <w:p>
@@ -3411,12 +4028,9 @@
           <w:szCs w:val="32"/>
         </w:rPr>
         <w:lastRenderedPageBreak/>
-        <w:t>Biography</w:t>
-      </w:r>
-    </w:p>
-    <w:p>
-      <w:pPr>
-        <w:jc w:val="center"/>
+        <w:t>B</w:t>
+      </w:r>
+      <w:r>
         <w:rPr>
           <w:rFonts w:ascii="Times New Roman" w:hAnsi="Times New Roman" w:cs="Times New Roman"/>
           <w:b/>
@@ -3424,7 +4038,8 @@
           <w:sz w:val="32"/>
           <w:szCs w:val="32"/>
         </w:rPr>
-      </w:pPr>
+        <w:t>iography</w:t>
+      </w:r>
     </w:p>
     <w:p>
       <w:pPr>
@@ -3440,105 +4055,7 @@
     </w:p>
     <w:p>
       <w:pPr>
-        <w:jc w:val="both"/>
-        <w:rPr>
-          <w:rFonts w:ascii="Times New Roman" w:hAnsi="Times New Roman" w:cs="Times New Roman"/>
-        </w:rPr>
-      </w:pPr>
-      <w:r>
-        <w:rPr>
-          <w:rFonts w:ascii="Times New Roman" w:hAnsi="Times New Roman" w:cs="Times New Roman"/>
-        </w:rPr>
-        <w:t xml:space="preserve">Fry, Hannah — Hello World: How to Be Human in the Age of the Machine, Black Swan (Transworld Publishers), London, 2018 </w:t>
-      </w:r>
-    </w:p>
-    <w:p>
-      <w:pPr>
-        <w:jc w:val="both"/>
-        <w:rPr>
-          <w:rFonts w:ascii="Times New Roman" w:hAnsi="Times New Roman" w:cs="Times New Roman"/>
-        </w:rPr>
-      </w:pPr>
-      <w:r>
-        <w:rPr>
-          <w:rFonts w:ascii="Times New Roman" w:hAnsi="Times New Roman" w:cs="Times New Roman"/>
-        </w:rPr>
-        <w:t xml:space="preserve">Tegmark, Max — Life 3.0: Being Human in the Age of Artificial Intelligence, Knopf, New York, 2017 </w:t>
-      </w:r>
-    </w:p>
-    <w:p>
-      <w:pPr>
-        <w:jc w:val="both"/>
-        <w:rPr>
-          <w:rFonts w:ascii="Times New Roman" w:hAnsi="Times New Roman" w:cs="Times New Roman"/>
-        </w:rPr>
-      </w:pPr>
-      <w:r>
-        <w:rPr>
-          <w:rFonts w:ascii="Times New Roman" w:hAnsi="Times New Roman" w:cs="Times New Roman"/>
-        </w:rPr>
-        <w:t xml:space="preserve">Bostrom, Nick — Superintelligence: Paths, Dangers, Strategies, Oxford University Press, Oxford, 2014 </w:t>
-      </w:r>
-    </w:p>
-    <w:p>
-      <w:pPr>
-        <w:jc w:val="both"/>
-        <w:rPr>
-          <w:rFonts w:ascii="Times New Roman" w:hAnsi="Times New Roman" w:cs="Times New Roman"/>
-        </w:rPr>
-      </w:pPr>
-      <w:r>
-        <w:rPr>
-          <w:rFonts w:ascii="Times New Roman" w:hAnsi="Times New Roman" w:cs="Times New Roman"/>
-        </w:rPr>
-        <w:t xml:space="preserve">Kislev, Elyakim — Relationships 5.0: How AI, VR, and Robots Will Reshape Our Emotional Lives, Oxford University Press, Oxford, 2022 </w:t>
-      </w:r>
-    </w:p>
-    <w:p>
-      <w:pPr>
-        <w:jc w:val="both"/>
-        <w:rPr>
-          <w:rFonts w:ascii="Times New Roman" w:hAnsi="Times New Roman" w:cs="Times New Roman"/>
-        </w:rPr>
-      </w:pPr>
-      <w:r>
-        <w:rPr>
-          <w:rFonts w:ascii="Times New Roman" w:hAnsi="Times New Roman" w:cs="Times New Roman"/>
-        </w:rPr>
-        <w:t xml:space="preserve">Gunkel, David J. — The Machine Question: Critical Perspectives on AI, Robots, and Ethics, MIT Press, Cambridge (MA), 2012 </w:t>
-      </w:r>
-    </w:p>
-    <w:p>
-      <w:pPr>
-        <w:jc w:val="both"/>
-        <w:rPr>
-          <w:rFonts w:ascii="Times New Roman" w:hAnsi="Times New Roman" w:cs="Times New Roman"/>
-        </w:rPr>
-      </w:pPr>
-      <w:r>
-        <w:rPr>
-          <w:rFonts w:ascii="Times New Roman" w:hAnsi="Times New Roman" w:cs="Times New Roman"/>
-        </w:rPr>
-        <w:t xml:space="preserve">Lee, Kai-Fu &amp; </w:t>
-      </w:r>
-      <w:proofErr w:type="spellStart"/>
-      <w:r>
-        <w:rPr>
-          <w:rFonts w:ascii="Times New Roman" w:hAnsi="Times New Roman" w:cs="Times New Roman"/>
-        </w:rPr>
-        <w:t>Qiufan</w:t>
-      </w:r>
-      <w:proofErr w:type="spellEnd"/>
-      <w:r>
-        <w:rPr>
-          <w:rFonts w:ascii="Times New Roman" w:hAnsi="Times New Roman" w:cs="Times New Roman"/>
-        </w:rPr>
-        <w:t>, Chen — AI 2041: Ten Visions for Our Future, (HarperCollins / unspecified in summary), (publication place — typically New York), 2021</w:t>
-      </w:r>
-    </w:p>
-    <w:p>
-      <w:pPr>
-        <w:jc w:val="both"/>
+        <w:jc w:val="center"/>
         <w:rPr>
           <w:rFonts w:ascii="Times New Roman" w:hAnsi="Times New Roman" w:cs="Times New Roman"/>
           <w:b/>
@@ -3548,7 +4065,118 @@
         </w:rPr>
       </w:pPr>
     </w:p>
+    <w:p>
+      <w:pPr>
+        <w:jc w:val="both"/>
+        <w:rPr>
+          <w:rFonts w:ascii="Times New Roman" w:hAnsi="Times New Roman" w:cs="Times New Roman"/>
+        </w:rPr>
+      </w:pPr>
+      <w:r>
+        <w:rPr>
+          <w:rFonts w:ascii="Times New Roman" w:hAnsi="Times New Roman" w:cs="Times New Roman"/>
+        </w:rPr>
+        <w:t xml:space="preserve">Fry, Hannah — Hello World: How to Be Human in the Age of the Machine, Black Swan (Transworld Publishers), London, 2018 </w:t>
+      </w:r>
+    </w:p>
+    <w:p>
+      <w:pPr>
+        <w:jc w:val="both"/>
+        <w:rPr>
+          <w:rFonts w:ascii="Times New Roman" w:hAnsi="Times New Roman" w:cs="Times New Roman"/>
+        </w:rPr>
+      </w:pPr>
+      <w:r>
+        <w:rPr>
+          <w:rFonts w:ascii="Times New Roman" w:hAnsi="Times New Roman" w:cs="Times New Roman"/>
+        </w:rPr>
+        <w:t xml:space="preserve">Tegmark, Max — Life 3.0: Being Human in the Age of Artificial Intelligence, Knopf, New York, 2017 </w:t>
+      </w:r>
+    </w:p>
+    <w:p>
+      <w:pPr>
+        <w:jc w:val="both"/>
+        <w:rPr>
+          <w:rFonts w:ascii="Times New Roman" w:hAnsi="Times New Roman" w:cs="Times New Roman"/>
+        </w:rPr>
+      </w:pPr>
+      <w:r>
+        <w:rPr>
+          <w:rFonts w:ascii="Times New Roman" w:hAnsi="Times New Roman" w:cs="Times New Roman"/>
+        </w:rPr>
+        <w:t xml:space="preserve">Bostrom, Nick — Superintelligence: Paths, Dangers, Strategies, Oxford University Press, Oxford, 2014 </w:t>
+      </w:r>
+    </w:p>
+    <w:p>
+      <w:pPr>
+        <w:jc w:val="both"/>
+        <w:rPr>
+          <w:rFonts w:ascii="Times New Roman" w:hAnsi="Times New Roman" w:cs="Times New Roman"/>
+        </w:rPr>
+      </w:pPr>
+      <w:r>
+        <w:rPr>
+          <w:rFonts w:ascii="Times New Roman" w:hAnsi="Times New Roman" w:cs="Times New Roman"/>
+        </w:rPr>
+        <w:t xml:space="preserve">Kislev, Elyakim — Relationships 5.0: How AI, VR, and Robots Will Reshape Our Emotional Lives, Oxford University Press, Oxford, 2022 </w:t>
+      </w:r>
+    </w:p>
+    <w:p>
+      <w:pPr>
+        <w:jc w:val="both"/>
+        <w:rPr>
+          <w:rFonts w:ascii="Times New Roman" w:hAnsi="Times New Roman" w:cs="Times New Roman"/>
+        </w:rPr>
+      </w:pPr>
+      <w:r>
+        <w:rPr>
+          <w:rFonts w:ascii="Times New Roman" w:hAnsi="Times New Roman" w:cs="Times New Roman"/>
+        </w:rPr>
+        <w:t xml:space="preserve">Gunkel, David J. — The Machine Question: Critical Perspectives on AI, Robots, and Ethics, MIT Press, Cambridge (MA), 2012 </w:t>
+      </w:r>
+    </w:p>
+    <w:p>
+      <w:pPr>
+        <w:jc w:val="both"/>
+        <w:rPr>
+          <w:rFonts w:ascii="Times New Roman" w:hAnsi="Times New Roman" w:cs="Times New Roman"/>
+        </w:rPr>
+      </w:pPr>
+      <w:r>
+        <w:rPr>
+          <w:rFonts w:ascii="Times New Roman" w:hAnsi="Times New Roman" w:cs="Times New Roman"/>
+        </w:rPr>
+        <w:t xml:space="preserve">Lee, Kai-Fu &amp; </w:t>
+      </w:r>
+      <w:proofErr w:type="spellStart"/>
+      <w:r>
+        <w:rPr>
+          <w:rFonts w:ascii="Times New Roman" w:hAnsi="Times New Roman" w:cs="Times New Roman"/>
+        </w:rPr>
+        <w:t>Qiufan</w:t>
+      </w:r>
+      <w:proofErr w:type="spellEnd"/>
+      <w:r>
+        <w:rPr>
+          <w:rFonts w:ascii="Times New Roman" w:hAnsi="Times New Roman" w:cs="Times New Roman"/>
+        </w:rPr>
+        <w:t>, Chen — AI 2041: Ten Visions for Our Future, (HarperCollins / unspecified in summary), (publication place — typically New York), 2021</w:t>
+      </w:r>
+    </w:p>
+    <w:p>
+      <w:pPr>
+        <w:jc w:val="both"/>
+        <w:rPr>
+          <w:rFonts w:ascii="Times New Roman" w:hAnsi="Times New Roman" w:cs="Times New Roman"/>
+          <w:b/>
+          <w:bCs/>
+          <w:sz w:val="32"/>
+          <w:szCs w:val="32"/>
+        </w:rPr>
+      </w:pPr>
+    </w:p>
     <w:sectPr>
+      <w:footerReference w:type="default" r:id="rId11"/>
       <w:pgSz w:w="11906" w:h="16838"/>
       <w:pgMar w:top="1417" w:right="1417" w:bottom="1417" w:left="1417" w:header="708" w:footer="708" w:gutter="0"/>
       <w:cols w:space="708"/>
@@ -3581,6 +4209,51 @@
     </w:p>
   </w:endnote>
 </w:endnotes>
+</file>
+
+<file path=word/footer1.xml><?xml version="1.0" encoding="utf-8"?>
+<w:ftr xmlns:wpc="http://schemas.microsoft.com/office/word/2010/wordprocessingCanvas" xmlns:cx="http://schemas.microsoft.com/office/drawing/2014/chartex" xmlns:cx1="http://schemas.microsoft.com/office/drawing/2015/9/8/chartex" xmlns:cx2="http://schemas.microsoft.com/office/drawing/2015/10/21/chartex" xmlns:cx3="http://schemas.microsoft.com/office/drawing/2016/5/9/chartex" xmlns:cx4="http://schemas.microsoft.com/office/drawing/2016/5/10/chartex" xmlns:cx5="http://schemas.microsoft.com/office/drawing/2016/5/11/chartex" xmlns:cx6="http://schemas.microsoft.com/office/drawing/2016/5/12/chartex" xmlns:cx7="http://schemas.microsoft.com/office/drawing/2016/5/13/chartex" xmlns:cx8="http://schemas.microsoft.com/office/drawing/2016/5/14/chartex" xmlns:mc="http://schemas.openxmlformats.org/markup-compatibility/2006" xmlns:aink="http://schemas.microsoft.com/office/drawing/2016/ink" xmlns:am3d="http://schemas.microsoft.com/office/drawing/2017/model3d" xmlns:o="urn:schemas-microsoft-com:office:office" xmlns:oel="http://schemas.microsoft.com/office/2019/extlst" xmlns:r="http://schemas.openxmlformats.org/officeDocument/2006/relationships" xmlns:m="http://schemas.openxmlformats.org/officeDocument/2006/math" xmlns:v="urn:schemas-microsoft-com:vml" xmlns:wp14="http://schemas.microsoft.com/office/word/2010/wordprocessingDrawing" xmlns:wp="http://schemas.openxmlformats.org/drawingml/2006/wordprocessingDrawing" xmlns:w10="urn:schemas-microsoft-com:office:word" xmlns:w="http://schemas.openxmlformats.org/wordprocessingml/2006/main" xmlns:w14="http://schemas.microsoft.com/office/word/2010/wordml" xmlns:w15="http://schemas.microsoft.com/office/word/2012/wordml" xmlns:w16cex="http://schemas.microsoft.com/office/word/2018/wordml/cex" xmlns:w16cid="http://schemas.microsoft.com/office/word/2016/wordml/cid" xmlns:w16="http://schemas.microsoft.com/office/word/2018/wordml" xmlns:w16du="http://schemas.microsoft.com/office/word/2023/wordml/word16du" xmlns:w16sdtdh="http://schemas.microsoft.com/office/word/2020/wordml/sdtdatahash" xmlns:w16sdtfl="http://schemas.microsoft.com/office/word/2024/wordml/sdtformatlock" xmlns:w16se="http://schemas.microsoft.com/office/word/2015/wordml/symex" xmlns:wpg="http://schemas.microsoft.com/office/word/2010/wordprocessingGroup" xmlns:wpi="http://schemas.microsoft.com/office/word/2010/wordprocessingInk" xmlns:wne="http://schemas.microsoft.com/office/word/2006/wordml" xmlns:wps="http://schemas.microsoft.com/office/word/2010/wordprocessingShape" mc:Ignorable="w14 w15 w16se w16cid w16 w16cex w16sdtdh w16sdtfl w16du wp14">
+  <w:sdt>
+    <w:sdtPr>
+      <w:id w:val="-1009753689"/>
+      <w:docPartObj>
+        <w:docPartGallery w:val="Page Numbers (Bottom of Page)"/>
+        <w:docPartUnique/>
+      </w:docPartObj>
+    </w:sdtPr>
+    <w:sdtContent>
+      <w:p>
+        <w:pPr>
+          <w:pStyle w:val="Footer"/>
+          <w:jc w:val="right"/>
+        </w:pPr>
+        <w:r>
+          <w:fldChar w:fldCharType="begin"/>
+        </w:r>
+        <w:r>
+          <w:instrText>PAGE   \* MERGEFORMAT</w:instrText>
+        </w:r>
+        <w:r>
+          <w:fldChar w:fldCharType="separate"/>
+        </w:r>
+        <w:r>
+          <w:rPr>
+            <w:lang w:val="ro-RO"/>
+          </w:rPr>
+          <w:t>2</w:t>
+        </w:r>
+        <w:r>
+          <w:fldChar w:fldCharType="end"/>
+        </w:r>
+      </w:p>
+    </w:sdtContent>
+  </w:sdt>
+  <w:p>
+    <w:pPr>
+      <w:pStyle w:val="Footer"/>
+    </w:pPr>
+  </w:p>
+</w:ftr>
 </file>
 
 <file path=word/footnotes.xml><?xml version="1.0" encoding="utf-8"?>
@@ -4214,7 +4887,6 @@
   <w:style w:type="character" w:default="1" w:styleId="DefaultParagraphFont">
     <w:name w:val="Default Paragraph Font"/>
     <w:uiPriority w:val="1"/>
-    <w:semiHidden/>
     <w:unhideWhenUsed/>
   </w:style>
   <w:style w:type="table" w:default="1" w:styleId="TableNormal">

</xml_diff>

<commit_message>
Final Final Final Triple Final.
</commit_message>
<xml_diff>
--- a/Atestat.docx
+++ b/Atestat.docx
@@ -4911,84 +4911,97 @@
       </w:pPr>
       <w:r>
         <w:rPr>
+          <w:rFonts w:ascii="Times New Roman" w:hAnsi="Times New Roman" w:cs="Times New Roman"/>
+        </w:rPr>
+        <w:t>The benefits of artificial intelligence are vast and diverse, and they are already transforming the way we live. From workplaces that are becoming more efficient, to homes that are smarter, to cities that are cleaner and safer, AI is a driving force of change. It offers the promise of a future where daily life is easier, healthier, and more connected. As these technologies continue to develop, we can expect even more improvements in areas such as transport, education, and personal wellbeing. However, this future will depend on how responsibly AI is designed and used, reminding us that progress must always be accompanied by careful and thoughtful choices.</w:t>
+      </w:r>
+    </w:p>
+    <w:p>
+      <w:pPr>
+        <w:rPr>
+          <w:rFonts w:ascii="Times New Roman" w:hAnsi="Times New Roman" w:cs="Times New Roman"/>
+        </w:rPr>
+      </w:pPr>
+      <w:r>
+        <w:rPr>
+          <w:rFonts w:ascii="Times New Roman" w:hAnsi="Times New Roman" w:cs="Times New Roman"/>
           <w:noProof/>
-        </w:rPr>
-        <w:drawing>
-          <wp:anchor distT="0" distB="0" distL="114300" distR="114300" simplePos="0" relativeHeight="251660288" behindDoc="1" locked="0" layoutInCell="1" allowOverlap="1" wp14:anchorId="239085BE" wp14:editId="2AAECC98">
-            <wp:simplePos x="0" y="0"/>
-            <wp:positionH relativeFrom="margin">
-              <wp:align>center</wp:align>
-            </wp:positionH>
-            <wp:positionV relativeFrom="paragraph">
-              <wp:posOffset>1975339</wp:posOffset>
-            </wp:positionV>
-            <wp:extent cx="3218571" cy="2145714"/>
-            <wp:effectExtent l="0" t="0" r="1270" b="6985"/>
-            <wp:wrapNone/>
-            <wp:docPr id="1217834032" name="Picture 1" descr="The Smart Cities Of The Future: 5 Ways Technology Is Transforming Our Cities  | Bernard Marr"/>
-            <wp:cNvGraphicFramePr>
-              <a:graphicFrameLocks xmlns:a="http://schemas.openxmlformats.org/drawingml/2006/main" noChangeAspect="1"/>
-            </wp:cNvGraphicFramePr>
-            <a:graphic xmlns:a="http://schemas.openxmlformats.org/drawingml/2006/main">
-              <a:graphicData uri="http://schemas.openxmlformats.org/drawingml/2006/picture">
-                <pic:pic xmlns:pic="http://schemas.openxmlformats.org/drawingml/2006/picture">
-                  <pic:nvPicPr>
-                    <pic:cNvPr id="0" name="Picture 1" descr="The Smart Cities Of The Future: 5 Ways Technology Is Transforming Our Cities  | Bernard Marr"/>
-                    <pic:cNvPicPr>
-                      <a:picLocks noChangeAspect="1" noChangeArrowheads="1"/>
-                    </pic:cNvPicPr>
-                  </pic:nvPicPr>
-                  <pic:blipFill>
-                    <a:blip r:embed="rId13" cstate="print">
-                      <a:extLst>
-                        <a:ext uri="{28A0092B-C50C-407E-A947-70E740481C1C}">
-                          <a14:useLocalDpi xmlns:a14="http://schemas.microsoft.com/office/drawing/2010/main" val="0"/>
-                        </a:ext>
-                      </a:extLst>
-                    </a:blip>
-                    <a:srcRect/>
-                    <a:stretch>
-                      <a:fillRect/>
-                    </a:stretch>
-                  </pic:blipFill>
-                  <pic:spPr bwMode="auto">
-                    <a:xfrm>
-                      <a:off x="0" y="0"/>
-                      <a:ext cx="3218571" cy="2145714"/>
-                    </a:xfrm>
-                    <a:prstGeom prst="rect">
-                      <a:avLst/>
-                    </a:prstGeom>
-                    <a:noFill/>
-                    <a:ln>
-                      <a:noFill/>
-                    </a:ln>
-                  </pic:spPr>
-                </pic:pic>
-              </a:graphicData>
-            </a:graphic>
-            <wp14:sizeRelH relativeFrom="page">
-              <wp14:pctWidth>0</wp14:pctWidth>
-            </wp14:sizeRelH>
-            <wp14:sizeRelV relativeFrom="page">
-              <wp14:pctHeight>0</wp14:pctHeight>
-            </wp14:sizeRelV>
-          </wp:anchor>
-        </w:drawing>
-      </w:r>
-      <w:r>
-        <w:rPr>
-          <w:rFonts w:ascii="Times New Roman" w:hAnsi="Times New Roman" w:cs="Times New Roman"/>
-        </w:rPr>
-        <w:t>The benefits of artificial intelligence are vast and diverse, and they are already transforming the way we live. From workplaces that are becoming more efficient, to homes that are smarter, to cities that are cleaner and safer, AI is a driving force of change. It offers the promise of a future where daily life is easier, healthier, and more connected. As these technologies continue to develop, we can expect even more improvements in areas such as transport, education, and personal wellbeing. However, this future will depend on how responsibly AI is designed and used, reminding us that progress must always be accompanied by careful and thoughtful choices.</w:t>
-      </w:r>
-    </w:p>
-    <w:p>
-      <w:pPr>
-        <w:rPr>
-          <w:rFonts w:ascii="Times New Roman" w:hAnsi="Times New Roman" w:cs="Times New Roman"/>
-        </w:rPr>
-      </w:pPr>
+          <w:sz w:val="28"/>
+          <w:szCs w:val="28"/>
+          <w:lang w:val="en-US"/>
+        </w:rPr>
+        <mc:AlternateContent>
+          <mc:Choice Requires="wps">
+            <w:drawing>
+              <wp:anchor distT="0" distB="0" distL="114300" distR="114300" simplePos="0" relativeHeight="251697152" behindDoc="0" locked="0" layoutInCell="1" allowOverlap="1" wp14:anchorId="72B3CEFA" wp14:editId="5E4EA783">
+                <wp:simplePos x="0" y="0"/>
+                <wp:positionH relativeFrom="column">
+                  <wp:posOffset>2525590</wp:posOffset>
+                </wp:positionH>
+                <wp:positionV relativeFrom="paragraph">
+                  <wp:posOffset>1266092</wp:posOffset>
+                </wp:positionV>
+                <wp:extent cx="631372" cy="500743"/>
+                <wp:effectExtent l="0" t="0" r="16510" b="13970"/>
+                <wp:wrapNone/>
+                <wp:docPr id="1139506475" name="Rectangle 1"/>
+                <wp:cNvGraphicFramePr/>
+                <a:graphic xmlns:a="http://schemas.openxmlformats.org/drawingml/2006/main">
+                  <a:graphicData uri="http://schemas.microsoft.com/office/word/2010/wordprocessingShape">
+                    <wps:wsp>
+                      <wps:cNvSpPr/>
+                      <wps:spPr>
+                        <a:xfrm>
+                          <a:off x="0" y="0"/>
+                          <a:ext cx="631372" cy="500743"/>
+                        </a:xfrm>
+                        <a:prstGeom prst="rect">
+                          <a:avLst/>
+                        </a:prstGeom>
+                        <a:solidFill>
+                          <a:schemeClr val="bg1"/>
+                        </a:solidFill>
+                        <a:ln>
+                          <a:solidFill>
+                            <a:schemeClr val="bg1"/>
+                          </a:solidFill>
+                        </a:ln>
+                      </wps:spPr>
+                      <wps:style>
+                        <a:lnRef idx="2">
+                          <a:schemeClr val="accent1">
+                            <a:shade val="15000"/>
+                          </a:schemeClr>
+                        </a:lnRef>
+                        <a:fillRef idx="1">
+                          <a:schemeClr val="accent1"/>
+                        </a:fillRef>
+                        <a:effectRef idx="0">
+                          <a:schemeClr val="accent1"/>
+                        </a:effectRef>
+                        <a:fontRef idx="minor">
+                          <a:schemeClr val="lt1"/>
+                        </a:fontRef>
+                      </wps:style>
+                      <wps:bodyPr rot="0" spcFirstLastPara="0" vertOverflow="overflow" horzOverflow="overflow" vert="horz" wrap="square" lIns="91440" tIns="45720" rIns="91440" bIns="45720" numCol="1" spcCol="0" rtlCol="0" fromWordArt="0" anchor="ctr" anchorCtr="0" forceAA="0" compatLnSpc="1">
+                        <a:prstTxWarp prst="textNoShape">
+                          <a:avLst/>
+                        </a:prstTxWarp>
+                        <a:noAutofit/>
+                      </wps:bodyPr>
+                    </wps:wsp>
+                  </a:graphicData>
+                </a:graphic>
+              </wp:anchor>
+            </w:drawing>
+          </mc:Choice>
+          <mc:Fallback>
+            <w:pict>
+              <v:rect w14:anchorId="2740CC5D" id="Rectangle 1" o:spid="_x0000_s1026" style="position:absolute;margin-left:198.85pt;margin-top:99.7pt;width:49.7pt;height:39.45pt;z-index:251697152;visibility:visible;mso-wrap-style:square;mso-wrap-distance-left:9pt;mso-wrap-distance-top:0;mso-wrap-distance-right:9pt;mso-wrap-distance-bottom:0;mso-position-horizontal:absolute;mso-position-horizontal-relative:text;mso-position-vertical:absolute;mso-position-vertical-relative:text;v-text-anchor:middle" o:gfxdata="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" fillcolor="white [3212]" strokecolor="white [3212]" strokeweight="1pt"/>
+            </w:pict>
+          </mc:Fallback>
+        </mc:AlternateContent>
+      </w:r>
       <w:r>
         <w:rPr>
           <w:rFonts w:ascii="Times New Roman" w:hAnsi="Times New Roman" w:cs="Times New Roman"/>
@@ -6019,7 +6032,7 @@
                     </pic:cNvPicPr>
                   </pic:nvPicPr>
                   <pic:blipFill>
-                    <a:blip r:embed="rId14">
+                    <a:blip r:embed="rId13">
                       <a:extLst>
                         <a:ext uri="{28A0092B-C50C-407E-A947-70E740481C1C}">
                           <a14:useLocalDpi xmlns:a14="http://schemas.microsoft.com/office/drawing/2010/main" val="0"/>
@@ -6194,6 +6207,7 @@
     </w:p>
     <w:p>
       <w:pPr>
+        <w:spacing w:line="360" w:lineRule="auto"/>
         <w:jc w:val="both"/>
         <w:rPr>
           <w:rFonts w:ascii="Times New Roman" w:hAnsi="Times New Roman" w:cs="Times New Roman"/>
@@ -6208,15 +6222,16 @@
     </w:p>
     <w:p>
       <w:pPr>
-        <w:jc w:val="both"/>
-        <w:rPr>
-          <w:rFonts w:ascii="Times New Roman" w:hAnsi="Times New Roman" w:cs="Times New Roman"/>
-        </w:rPr>
-      </w:pPr>
-    </w:p>
-    <w:p>
-      <w:pPr>
-        <w:ind w:firstLine="708"/>
+        <w:spacing w:line="360" w:lineRule="auto"/>
+        <w:jc w:val="both"/>
+        <w:rPr>
+          <w:rFonts w:ascii="Times New Roman" w:hAnsi="Times New Roman" w:cs="Times New Roman"/>
+        </w:rPr>
+      </w:pPr>
+    </w:p>
+    <w:p>
+      <w:pPr>
+        <w:spacing w:line="360" w:lineRule="auto"/>
         <w:jc w:val="both"/>
         <w:rPr>
           <w:rFonts w:ascii="Times New Roman" w:hAnsi="Times New Roman" w:cs="Times New Roman"/>
@@ -6267,23 +6282,19 @@
     </w:p>
     <w:p>
       <w:pPr>
-        <w:jc w:val="both"/>
-        <w:rPr>
-          <w:rFonts w:ascii="Times New Roman" w:hAnsi="Times New Roman" w:cs="Times New Roman"/>
-        </w:rPr>
-      </w:pPr>
-    </w:p>
-    <w:p>
-      <w:pPr>
-        <w:ind w:firstLine="708"/>
-        <w:jc w:val="both"/>
-        <w:rPr>
-          <w:rFonts w:ascii="Times New Roman" w:hAnsi="Times New Roman" w:cs="Times New Roman"/>
-          <w:b/>
-          <w:bCs/>
-          <w:sz w:val="32"/>
-          <w:szCs w:val="32"/>
-          <w:lang w:val="ro-RO"/>
+        <w:spacing w:line="360" w:lineRule="auto"/>
+        <w:jc w:val="both"/>
+        <w:rPr>
+          <w:rFonts w:ascii="Times New Roman" w:hAnsi="Times New Roman" w:cs="Times New Roman"/>
+        </w:rPr>
+      </w:pPr>
+    </w:p>
+    <w:p>
+      <w:pPr>
+        <w:spacing w:line="360" w:lineRule="auto"/>
+        <w:jc w:val="both"/>
+        <w:rPr>
+          <w:rFonts w:ascii="Times New Roman" w:hAnsi="Times New Roman" w:cs="Times New Roman"/>
         </w:rPr>
       </w:pPr>
       <w:r>
@@ -6295,11 +6306,6 @@
       <w:r>
         <w:rPr>
           <w:rFonts w:ascii="Times New Roman" w:hAnsi="Times New Roman" w:cs="Times New Roman"/>
-          <w:b/>
-          <w:bCs/>
-          <w:sz w:val="32"/>
-          <w:szCs w:val="32"/>
-          <w:lang w:val="ro-RO"/>
         </w:rPr>
         <w:t xml:space="preserve"> </w:t>
       </w:r>
@@ -6312,21 +6318,16 @@
     </w:p>
     <w:p>
       <w:pPr>
-        <w:rPr>
-          <w:rFonts w:ascii="Times New Roman" w:hAnsi="Times New Roman" w:cs="Times New Roman"/>
-          <w:b/>
-          <w:bCs/>
-          <w:sz w:val="32"/>
-          <w:szCs w:val="32"/>
+        <w:spacing w:line="360" w:lineRule="auto"/>
+        <w:jc w:val="both"/>
+        <w:rPr>
+          <w:rFonts w:ascii="Times New Roman" w:hAnsi="Times New Roman" w:cs="Times New Roman"/>
         </w:rPr>
       </w:pPr>
       <w:r>
         <w:rPr>
           <w:rFonts w:ascii="Times New Roman" w:hAnsi="Times New Roman" w:cs="Times New Roman"/>
           <w:noProof/>
-          <w:sz w:val="28"/>
-          <w:szCs w:val="28"/>
-          <w:lang w:val="en-US"/>
         </w:rPr>
         <mc:AlternateContent>
           <mc:Choice Requires="wps">
@@ -6405,17 +6406,22 @@
       <w:r>
         <w:rPr>
           <w:rFonts w:ascii="Times New Roman" w:hAnsi="Times New Roman" w:cs="Times New Roman"/>
+        </w:rPr>
+        <w:br w:type="page"/>
+      </w:r>
+    </w:p>
+    <w:p>
+      <w:pPr>
+        <w:jc w:val="center"/>
+        <w:rPr>
+          <w:rFonts w:ascii="Times New Roman" w:hAnsi="Times New Roman" w:cs="Times New Roman"/>
           <w:b/>
           <w:bCs/>
           <w:sz w:val="32"/>
           <w:szCs w:val="32"/>
         </w:rPr>
-        <w:br w:type="page"/>
-      </w:r>
-    </w:p>
-    <w:p>
-      <w:pPr>
-        <w:jc w:val="center"/>
+      </w:pPr>
+      <w:r>
         <w:rPr>
           <w:rFonts w:ascii="Times New Roman" w:hAnsi="Times New Roman" w:cs="Times New Roman"/>
           <w:b/>
@@ -6423,7 +6429,9 @@
           <w:sz w:val="32"/>
           <w:szCs w:val="32"/>
         </w:rPr>
-      </w:pPr>
+        <w:lastRenderedPageBreak/>
+        <w:t>B</w:t>
+      </w:r>
       <w:r>
         <w:rPr>
           <w:rFonts w:ascii="Times New Roman" w:hAnsi="Times New Roman" w:cs="Times New Roman"/>
@@ -6432,8 +6440,7 @@
           <w:sz w:val="32"/>
           <w:szCs w:val="32"/>
         </w:rPr>
-        <w:lastRenderedPageBreak/>
-        <w:t>B</w:t>
+        <w:t>i</w:t>
       </w:r>
       <w:r>
         <w:rPr>
@@ -6443,9 +6450,12 @@
           <w:sz w:val="32"/>
           <w:szCs w:val="32"/>
         </w:rPr>
-        <w:t>i</w:t>
-      </w:r>
-      <w:r>
+        <w:t>bliography</w:t>
+      </w:r>
+    </w:p>
+    <w:p>
+      <w:pPr>
+        <w:jc w:val="center"/>
         <w:rPr>
           <w:rFonts w:ascii="Times New Roman" w:hAnsi="Times New Roman" w:cs="Times New Roman"/>
           <w:b/>
@@ -6453,8 +6463,7 @@
           <w:sz w:val="32"/>
           <w:szCs w:val="32"/>
         </w:rPr>
-        <w:t>bliography</w:t>
-      </w:r>
+      </w:pPr>
     </w:p>
     <w:p>
       <w:pPr>
@@ -6470,18 +6479,7 @@
     </w:p>
     <w:p>
       <w:pPr>
-        <w:jc w:val="center"/>
-        <w:rPr>
-          <w:rFonts w:ascii="Times New Roman" w:hAnsi="Times New Roman" w:cs="Times New Roman"/>
-          <w:b/>
-          <w:bCs/>
-          <w:sz w:val="32"/>
-          <w:szCs w:val="32"/>
-        </w:rPr>
-      </w:pPr>
-    </w:p>
-    <w:p>
-      <w:pPr>
+        <w:spacing w:line="360" w:lineRule="auto"/>
         <w:jc w:val="both"/>
         <w:rPr>
           <w:rFonts w:ascii="Times New Roman" w:hAnsi="Times New Roman" w:cs="Times New Roman"/>
@@ -6508,14 +6506,16 @@
     </w:p>
     <w:p>
       <w:pPr>
-        <w:jc w:val="both"/>
-        <w:rPr>
-          <w:rFonts w:ascii="Times New Roman" w:hAnsi="Times New Roman" w:cs="Times New Roman"/>
-        </w:rPr>
-      </w:pPr>
-    </w:p>
-    <w:p>
-      <w:pPr>
+        <w:spacing w:line="360" w:lineRule="auto"/>
+        <w:jc w:val="both"/>
+        <w:rPr>
+          <w:rFonts w:ascii="Times New Roman" w:hAnsi="Times New Roman" w:cs="Times New Roman"/>
+        </w:rPr>
+      </w:pPr>
+    </w:p>
+    <w:p>
+      <w:pPr>
+        <w:spacing w:line="360" w:lineRule="auto"/>
         <w:jc w:val="both"/>
         <w:rPr>
           <w:rFonts w:ascii="Times New Roman" w:hAnsi="Times New Roman" w:cs="Times New Roman"/>
@@ -6544,14 +6544,16 @@
     </w:p>
     <w:p>
       <w:pPr>
-        <w:jc w:val="both"/>
-        <w:rPr>
-          <w:rFonts w:ascii="Times New Roman" w:hAnsi="Times New Roman" w:cs="Times New Roman"/>
-        </w:rPr>
-      </w:pPr>
-    </w:p>
-    <w:p>
-      <w:pPr>
+        <w:spacing w:line="360" w:lineRule="auto"/>
+        <w:jc w:val="both"/>
+        <w:rPr>
+          <w:rFonts w:ascii="Times New Roman" w:hAnsi="Times New Roman" w:cs="Times New Roman"/>
+        </w:rPr>
+      </w:pPr>
+    </w:p>
+    <w:p>
+      <w:pPr>
+        <w:spacing w:line="360" w:lineRule="auto"/>
         <w:jc w:val="both"/>
         <w:rPr>
           <w:rFonts w:ascii="Times New Roman" w:hAnsi="Times New Roman" w:cs="Times New Roman"/>
@@ -6572,14 +6574,16 @@
     </w:p>
     <w:p>
       <w:pPr>
-        <w:jc w:val="both"/>
-        <w:rPr>
-          <w:rFonts w:ascii="Times New Roman" w:hAnsi="Times New Roman" w:cs="Times New Roman"/>
-        </w:rPr>
-      </w:pPr>
-    </w:p>
-    <w:p>
-      <w:pPr>
+        <w:spacing w:line="360" w:lineRule="auto"/>
+        <w:jc w:val="both"/>
+        <w:rPr>
+          <w:rFonts w:ascii="Times New Roman" w:hAnsi="Times New Roman" w:cs="Times New Roman"/>
+        </w:rPr>
+      </w:pPr>
+    </w:p>
+    <w:p>
+      <w:pPr>
+        <w:spacing w:line="360" w:lineRule="auto"/>
         <w:jc w:val="both"/>
         <w:rPr>
           <w:rFonts w:ascii="Times New Roman" w:hAnsi="Times New Roman" w:cs="Times New Roman"/>
@@ -6600,14 +6604,16 @@
     </w:p>
     <w:p>
       <w:pPr>
-        <w:jc w:val="both"/>
-        <w:rPr>
-          <w:rFonts w:ascii="Times New Roman" w:hAnsi="Times New Roman" w:cs="Times New Roman"/>
-        </w:rPr>
-      </w:pPr>
-    </w:p>
-    <w:p>
-      <w:pPr>
+        <w:spacing w:line="360" w:lineRule="auto"/>
+        <w:jc w:val="both"/>
+        <w:rPr>
+          <w:rFonts w:ascii="Times New Roman" w:hAnsi="Times New Roman" w:cs="Times New Roman"/>
+        </w:rPr>
+      </w:pPr>
+    </w:p>
+    <w:p>
+      <w:pPr>
+        <w:spacing w:line="360" w:lineRule="auto"/>
         <w:jc w:val="both"/>
         <w:rPr>
           <w:rFonts w:ascii="Times New Roman" w:hAnsi="Times New Roman" w:cs="Times New Roman"/>
@@ -6628,14 +6634,16 @@
     </w:p>
     <w:p>
       <w:pPr>
-        <w:jc w:val="both"/>
-        <w:rPr>
-          <w:rFonts w:ascii="Times New Roman" w:hAnsi="Times New Roman" w:cs="Times New Roman"/>
-        </w:rPr>
-      </w:pPr>
-    </w:p>
-    <w:p>
-      <w:pPr>
+        <w:spacing w:line="360" w:lineRule="auto"/>
+        <w:jc w:val="both"/>
+        <w:rPr>
+          <w:rFonts w:ascii="Times New Roman" w:hAnsi="Times New Roman" w:cs="Times New Roman"/>
+        </w:rPr>
+      </w:pPr>
+    </w:p>
+    <w:p>
+      <w:pPr>
+        <w:spacing w:line="360" w:lineRule="auto"/>
         <w:jc w:val="both"/>
         <w:rPr>
           <w:rFonts w:ascii="Times New Roman" w:hAnsi="Times New Roman" w:cs="Times New Roman"/>
@@ -6645,9 +6653,6 @@
         <w:rPr>
           <w:rFonts w:ascii="Times New Roman" w:hAnsi="Times New Roman" w:cs="Times New Roman"/>
           <w:noProof/>
-          <w:sz w:val="28"/>
-          <w:szCs w:val="28"/>
-          <w:lang w:val="en-US"/>
         </w:rPr>
         <mc:AlternateContent>
           <mc:Choice Requires="wps">
@@ -7049,7 +7054,7 @@
       </w:r>
     </w:p>
     <w:sectPr>
-      <w:footerReference w:type="first" r:id="rId15"/>
+      <w:footerReference w:type="first" r:id="rId14"/>
       <w:pgSz w:w="11906" w:h="16838"/>
       <w:pgMar w:top="1417" w:right="1417" w:bottom="1417" w:left="1417" w:header="708" w:footer="708" w:gutter="0"/>
       <w:cols w:space="708"/>

</xml_diff>

<commit_message>
Replace project with paper.
</commit_message>
<xml_diff>
--- a/Atestat.docx
+++ b/Atestat.docx
@@ -11,34 +11,14 @@
           <w:szCs w:val="32"/>
         </w:rPr>
       </w:pPr>
-      <w:proofErr w:type="spellStart"/>
       <w:r>
         <w:rPr>
           <w:rFonts w:ascii="Times New Roman" w:hAnsi="Times New Roman" w:cs="Times New Roman"/>
           <w:sz w:val="32"/>
           <w:szCs w:val="32"/>
         </w:rPr>
-        <w:t>Colegiul</w:t>
-      </w:r>
-      <w:proofErr w:type="spellEnd"/>
-      <w:r>
-        <w:rPr>
-          <w:rFonts w:ascii="Times New Roman" w:hAnsi="Times New Roman" w:cs="Times New Roman"/>
-          <w:sz w:val="32"/>
-          <w:szCs w:val="32"/>
-        </w:rPr>
-        <w:t xml:space="preserve"> </w:t>
-      </w:r>
-      <w:proofErr w:type="gramStart"/>
-      <w:r>
-        <w:rPr>
-          <w:rFonts w:ascii="Times New Roman" w:hAnsi="Times New Roman" w:cs="Times New Roman"/>
-          <w:sz w:val="32"/>
-          <w:szCs w:val="32"/>
-        </w:rPr>
-        <w:t>Na</w:t>
-      </w:r>
-      <w:proofErr w:type="spellStart"/>
+        <w:t>Colegiul Na</w:t>
+      </w:r>
       <w:r>
         <w:rPr>
           <w:rFonts w:ascii="Times New Roman" w:hAnsi="Times New Roman" w:cs="Times New Roman"/>
@@ -46,19 +26,8 @@
           <w:szCs w:val="32"/>
           <w:lang w:val="ro-RO"/>
         </w:rPr>
-        <w:t>țional</w:t>
-      </w:r>
-      <w:proofErr w:type="spellEnd"/>
-      <w:r>
-        <w:rPr>
-          <w:rFonts w:ascii="Times New Roman" w:hAnsi="Times New Roman" w:cs="Times New Roman"/>
-          <w:sz w:val="32"/>
-          <w:szCs w:val="32"/>
-          <w:lang w:val="ro-RO"/>
-        </w:rPr>
-        <w:t xml:space="preserve"> ,,Decebal</w:t>
-      </w:r>
-      <w:proofErr w:type="gramEnd"/>
+        <w:t>țional ,,Decebal</w:t>
+      </w:r>
       <w:r>
         <w:rPr>
           <w:rFonts w:ascii="Times New Roman" w:hAnsi="Times New Roman" w:cs="Times New Roman"/>
@@ -548,25 +517,14 @@
           <w:szCs w:val="32"/>
         </w:rPr>
       </w:pPr>
-      <w:proofErr w:type="spellStart"/>
       <w:r>
         <w:rPr>
           <w:rFonts w:ascii="Times New Roman" w:hAnsi="Times New Roman" w:cs="Times New Roman"/>
           <w:sz w:val="32"/>
           <w:szCs w:val="32"/>
         </w:rPr>
-        <w:t>Colegiul</w:t>
-      </w:r>
-      <w:proofErr w:type="spellEnd"/>
-      <w:r>
-        <w:rPr>
-          <w:rFonts w:ascii="Times New Roman" w:hAnsi="Times New Roman" w:cs="Times New Roman"/>
-          <w:sz w:val="32"/>
-          <w:szCs w:val="32"/>
-        </w:rPr>
-        <w:t xml:space="preserve"> Na</w:t>
-      </w:r>
-      <w:proofErr w:type="spellStart"/>
+        <w:t>Colegiul Na</w:t>
+      </w:r>
       <w:r>
         <w:rPr>
           <w:rFonts w:ascii="Times New Roman" w:hAnsi="Times New Roman" w:cs="Times New Roman"/>
@@ -574,17 +532,7 @@
           <w:szCs w:val="32"/>
           <w:lang w:val="ro-RO"/>
         </w:rPr>
-        <w:t>țional</w:t>
-      </w:r>
-      <w:proofErr w:type="spellEnd"/>
-      <w:r>
-        <w:rPr>
-          <w:rFonts w:ascii="Times New Roman" w:hAnsi="Times New Roman" w:cs="Times New Roman"/>
-          <w:sz w:val="32"/>
-          <w:szCs w:val="32"/>
-          <w:lang w:val="ro-RO"/>
-        </w:rPr>
-        <w:t xml:space="preserve"> ,,Decebal</w:t>
+        <w:t>țional ,,Decebal</w:t>
       </w:r>
       <w:r>
         <w:rPr>
@@ -853,7 +801,6 @@
         </w:rPr>
         <w:t>C</w:t>
       </w:r>
-      <w:proofErr w:type="spellStart"/>
       <w:r>
         <w:rPr>
           <w:rFonts w:ascii="Times New Roman" w:hAnsi="Times New Roman" w:cs="Times New Roman"/>
@@ -863,7 +810,6 @@
         </w:rPr>
         <w:t>îm</w:t>
       </w:r>
-      <w:proofErr w:type="spellEnd"/>
       <w:r>
         <w:rPr>
           <w:rFonts w:ascii="Times New Roman" w:hAnsi="Times New Roman" w:cs="Times New Roman"/>
@@ -2414,7 +2360,19 @@
         <w:rPr>
           <w:rFonts w:ascii="Times New Roman" w:hAnsi="Times New Roman" w:cs="Times New Roman"/>
         </w:rPr>
-        <w:t>One of the reasons I picked this topic for my project is that I genuinely think AI is going to keep changing the way we live, in ways we</w:t>
+        <w:t xml:space="preserve">One of the reasons I picked this topic for my </w:t>
+      </w:r>
+      <w:r>
+        <w:rPr>
+          <w:rFonts w:ascii="Times New Roman" w:hAnsi="Times New Roman" w:cs="Times New Roman"/>
+        </w:rPr>
+        <w:t xml:space="preserve">paper </w:t>
+      </w:r>
+      <w:r>
+        <w:rPr>
+          <w:rFonts w:ascii="Times New Roman" w:hAnsi="Times New Roman" w:cs="Times New Roman"/>
+        </w:rPr>
+        <w:t>is that I genuinely think AI is going to keep changing the way we live, in ways we</w:t>
       </w:r>
       <w:r>
         <w:rPr>
@@ -2773,7 +2731,19 @@
         <w:rPr>
           <w:rFonts w:ascii="Times New Roman" w:hAnsi="Times New Roman" w:cs="Times New Roman"/>
         </w:rPr>
-        <w:t>With this project, I want to explore how AI is affecting everyday life</w:t>
+        <w:t>With this</w:t>
+      </w:r>
+      <w:r>
+        <w:rPr>
+          <w:rFonts w:ascii="Times New Roman" w:hAnsi="Times New Roman" w:cs="Times New Roman"/>
+        </w:rPr>
+        <w:t xml:space="preserve"> paper</w:t>
+      </w:r>
+      <w:r>
+        <w:rPr>
+          <w:rFonts w:ascii="Times New Roman" w:hAnsi="Times New Roman" w:cs="Times New Roman"/>
+        </w:rPr>
+        <w:t>, I want to explore how AI is affecting everyday life</w:t>
       </w:r>
       <w:r>
         <w:rPr>
@@ -6155,7 +6125,19 @@
         <w:rPr>
           <w:rFonts w:ascii="Times New Roman" w:hAnsi="Times New Roman" w:cs="Times New Roman"/>
         </w:rPr>
-        <w:t>The rapid evolution of artificial intelligence has already transformed many aspects of everyday life, and its influence will continue to expand in the years ahead. Throughout this project, I have examined the ways in which AI brings significant advantages but also creates new challenges for individuals and society. Modern technologies assist people at work by automating repetitive tasks, improving productivity, and opening the path to more flexible forms of employment. In personal life, AI increases comfort and accessibility through smart homes, digital assistants, and health-monitoring devices. The development of smart cities further shows how urban environments can become cleaner, safer, and more efficient when guided by intelligent systems.</w:t>
+        <w:t>The rapid evolution of artificial intelligence has already transformed many aspects of everyday life, and its influence will continue to expand in the years ahead. Throughout this</w:t>
+      </w:r>
+      <w:r>
+        <w:rPr>
+          <w:rFonts w:ascii="Times New Roman" w:hAnsi="Times New Roman" w:cs="Times New Roman"/>
+        </w:rPr>
+        <w:t xml:space="preserve"> paper</w:t>
+      </w:r>
+      <w:r>
+        <w:rPr>
+          <w:rFonts w:ascii="Times New Roman" w:hAnsi="Times New Roman" w:cs="Times New Roman"/>
+        </w:rPr>
+        <w:t>, I have examined the ways in which AI brings significant advantages but also creates new challenges for individuals and society. Modern technologies assist people at work by automating repetitive tasks, improving productivity, and opening the path to more flexible forms of employment. In personal life, AI increases comfort and accessibility through smart homes, digital assistants, and health-monitoring devices. The development of smart cities further shows how urban environments can become cleaner, safer, and more efficient when guided by intelligent systems.</w:t>
       </w:r>
     </w:p>
     <w:p>
@@ -6549,19 +6531,11 @@
         </w:rPr>
         <w:t xml:space="preserve">2) </w:t>
       </w:r>
-      <w:proofErr w:type="spellStart"/>
-      <w:r>
-        <w:rPr>
-          <w:rFonts w:ascii="Times New Roman" w:hAnsi="Times New Roman" w:cs="Times New Roman"/>
-        </w:rPr>
-        <w:t>Tegmark</w:t>
-      </w:r>
-      <w:proofErr w:type="spellEnd"/>
-      <w:r>
-        <w:rPr>
-          <w:rFonts w:ascii="Times New Roman" w:hAnsi="Times New Roman" w:cs="Times New Roman"/>
-        </w:rPr>
-        <w:t xml:space="preserve">, Max — Life 3.0: Being Human in the Age of Artificial Intelligence, Knopf, New York, 2017 </w:t>
+      <w:r>
+        <w:rPr>
+          <w:rFonts w:ascii="Times New Roman" w:hAnsi="Times New Roman" w:cs="Times New Roman"/>
+        </w:rPr>
+        <w:t xml:space="preserve">Tegmark, Max — Life 3.0: Being Human in the Age of Artificial Intelligence, Knopf, New York, 2017 </w:t>
       </w:r>
     </w:p>
     <w:p>
@@ -7122,21 +7096,7 @@
         <w:rPr>
           <w:rFonts w:ascii="Times New Roman" w:hAnsi="Times New Roman" w:cs="Times New Roman"/>
         </w:rPr>
-        <w:t xml:space="preserve">Lee, Kai-Fu &amp; </w:t>
-      </w:r>
-      <w:proofErr w:type="spellStart"/>
-      <w:r>
-        <w:rPr>
-          <w:rFonts w:ascii="Times New Roman" w:hAnsi="Times New Roman" w:cs="Times New Roman"/>
-        </w:rPr>
-        <w:t>Qiufan</w:t>
-      </w:r>
-      <w:proofErr w:type="spellEnd"/>
-      <w:r>
-        <w:rPr>
-          <w:rFonts w:ascii="Times New Roman" w:hAnsi="Times New Roman" w:cs="Times New Roman"/>
-        </w:rPr>
-        <w:t>, Chen — AI 2041: Ten Visions for Our Future</w:t>
+        <w:t>Lee, Kai-Fu &amp; Qiufan, Chen — AI 2041: Ten Visions for Our Future</w:t>
       </w:r>
       <w:r>
         <w:rPr>

</xml_diff>